<commit_message>
docs: explain shortest path vs TSP and document the genetic algorithm and Gemini integration
</commit_message>
<xml_diff>
--- a/Informe Final PEF.docx
+++ b/Informe Final PEF.docx
@@ -652,37 +652,14 @@
           <w:bCs/>
           <w:color w:val="000000"/>
         </w:rPr>
-        <w:t>app.ml (Inteligencia Artificial y Análisis de Datos):</w:t>
-      </w:r>
-      <w:r>
-        <w:rPr>
-          <w:rFonts w:ascii="Arial" w:eastAsia="Arial" w:hAnsi="Arial" w:cs="Arial"/>
-          <w:color w:val="000000"/>
-        </w:rPr>
-        <w:t xml:space="preserve"> Contiene el motor de recomendaciones inteligente (TravelRecommender), los mecanismos de ingestión y preprocesamiento de datos (DataLoader) y la lóg</w:t>
-      </w:r>
-      <w:r>
-        <w:rPr>
-          <w:rFonts w:ascii="Arial" w:eastAsia="Arial" w:hAnsi="Arial" w:cs="Arial"/>
-          <w:color w:val="000000"/>
-        </w:rPr>
-        <w:t>ica asociada al aprendizaje en línea (</w:t>
-      </w:r>
-      <w:r>
-        <w:rPr>
-          <w:rFonts w:ascii="Arial" w:eastAsia="Arial" w:hAnsi="Arial" w:cs="Arial"/>
-          <w:i/>
-          <w:iCs/>
-          <w:color w:val="000000"/>
-        </w:rPr>
-        <w:t>Online Learning</w:t>
-      </w:r>
-      <w:r>
-        <w:rPr>
-          <w:rFonts w:ascii="Arial" w:eastAsia="Arial" w:hAnsi="Arial" w:cs="Arial"/>
-          <w:color w:val="000000"/>
-        </w:rPr>
-        <w:t>), permitiendo al sistema adaptarse dinámicamente a las preferencias del usuario.</w:t>
+        <w:t xml:space="preserve">app.ai (Inteligencia Artificial):</w:t>
+      </w:r>
+      <w:r>
+        <w:rPr>
+          <w:rFonts w:ascii="Arial" w:eastAsia="Arial" w:hAnsi="Arial" w:cs="Arial"/>
+          <w:color w:val="000000"/>
+        </w:rPr>
+        <w:t xml:space="preserve"> Integra el modelo de lenguaje Google Gemini para generar recomendaciones de lugares a visitar en cada ciudad del itinerario. Mantiene un cliente único, reutiliza respuestas ya obtenidas y degrada de forma controlada ante fallos, de modo que la ausencia de la IA no afecta al resto del sistema.</w:t>
       </w:r>
     </w:p>
     <w:p>
@@ -973,21 +950,14 @@
           <w:bCs/>
           <w:color w:val="000000"/>
         </w:rPr>
-        <w:t>Ciencia de Datos:</w:t>
-      </w:r>
-      <w:r>
-        <w:rPr>
-          <w:rFonts w:ascii="Arial" w:eastAsia="Arial" w:hAnsi="Arial" w:cs="Arial"/>
-          <w:color w:val="000000"/>
-        </w:rPr>
-        <w:t xml:space="preserve"> Scikit-learn (Algoritmos KNN y TF-IDF para el motor de recomendaciones), Pandas (Manipulación eficiente de es</w:t>
-      </w:r>
-      <w:r>
-        <w:rPr>
-          <w:rFonts w:ascii="Arial" w:eastAsia="Arial" w:hAnsi="Arial" w:cs="Arial"/>
-          <w:color w:val="000000"/>
-        </w:rPr>
-        <w:t>tructuras de datos), NumPy (Cálculo numérico optimizado).</w:t>
+        <w:t xml:space="preserve">Inteligencia Artificial y Visualización:</w:t>
+      </w:r>
+      <w:r>
+        <w:rPr>
+          <w:rFonts w:ascii="Arial" w:eastAsia="Arial" w:hAnsi="Arial" w:cs="Arial"/>
+          <w:color w:val="000000"/>
+        </w:rPr>
+        <w:t xml:space="preserve"> Google Gemini mediante el SDK oficial google-genai (modelo gemini-2.5-flash-lite) para las recomendaciones; Pandas y Altair para las tablas y gráficos de resultados en la interfaz.</w:t>
       </w:r>
     </w:p>
     <w:p>
@@ -1108,6 +1078,654 @@
           <w:szCs w:val="26"/>
         </w:rPr>
       </w:pPr>
+      <w:r>
+        <w:rPr>
+          <w:rFonts w:ascii="Arial" w:eastAsia="Arial" w:hAnsi="Arial" w:cs="Arial"/>
+          <w:color w:val="000000"/>
+          <w:sz w:val="26"/>
+          <w:szCs w:val="26"/>
+        </w:rPr>
+        <w:t xml:space="preserve">4.1. Planteo del Problema: Camino Mínimo frente a Orden de Visita</w:t>
+      </w:r>
+    </w:p>
+    <w:p>
+      <w:pPr>
+        <w:spacing w:before="240" w:after="240" w:line="240" w:lineRule="auto"/>
+        <w:rPr>
+          <w:rFonts w:ascii="Arial" w:eastAsia="Arial" w:hAnsi="Arial" w:cs="Arial"/>
+          <w:color w:val="000000"/>
+        </w:rPr>
+      </w:pPr>
+      <w:r>
+        <w:rPr>
+          <w:rFonts w:ascii="Arial" w:eastAsia="Arial" w:hAnsi="Arial" w:cs="Arial"/>
+          <w:color w:val="000000"/>
+        </w:rPr>
+        <w:t xml:space="preserve">Antes de describir cada algoritmo conviene distinguir las dos preguntas que el planificador debe responder, ya que, aunque en apariencia similares, constituyen problemas computacionales de naturaleza muy distinta:</w:t>
+      </w:r>
+    </w:p>
+    <w:p>
+      <w:pPr>
+        <w:numPr>
+          <w:ilvl w:val="0"/>
+          <w:numId w:val="2"/>
+        </w:numPr>
+        <w:spacing w:before="240" w:line="240" w:lineRule="auto"/>
+        <w:rPr>
+          <w:color w:val="000000"/>
+        </w:rPr>
+      </w:pPr>
+      <w:r>
+        <w:rPr>
+          <w:rFonts w:ascii="Arial" w:eastAsia="Arial" w:hAnsi="Arial" w:cs="Arial"/>
+          <w:b/>
+          <w:bCs/>
+          <w:color w:val="000000"/>
+        </w:rPr>
+        <w:t xml:space="preserve">Camino mínimo entre dos ciudades:</w:t>
+      </w:r>
+      <w:r>
+        <w:rPr>
+          <w:rFonts w:ascii="Arial" w:eastAsia="Arial" w:hAnsi="Arial" w:cs="Arial"/>
+          <w:color w:val="000000"/>
+        </w:rPr>
+        <w:t xml:space="preserve"> dado un origen y un destino (por ejemplo, Madrid → Roma), determinar la ruta de menor costo o tiempo. Se resuelve de forma exacta y eficiente mediante el algoritmo de Dijkstra, con complejidad O((V + E) log V).</w:t>
+      </w:r>
+    </w:p>
+    <w:p>
+      <w:pPr>
+        <w:numPr>
+          <w:ilvl w:val="0"/>
+          <w:numId w:val="2"/>
+        </w:numPr>
+        <w:spacing w:before="0" w:after="240" w:line="240" w:lineRule="auto"/>
+        <w:rPr>
+          <w:color w:val="000000"/>
+        </w:rPr>
+      </w:pPr>
+      <w:r>
+        <w:rPr>
+          <w:rFonts w:ascii="Arial" w:eastAsia="Arial" w:hAnsi="Arial" w:cs="Arial"/>
+          <w:b/>
+          <w:bCs/>
+          <w:color w:val="000000"/>
+        </w:rPr>
+        <w:t xml:space="preserve">Orden de visita de un itinerario multidestino:</w:t>
+      </w:r>
+      <w:r>
+        <w:rPr>
+          <w:rFonts w:ascii="Arial" w:eastAsia="Arial" w:hAnsi="Arial" w:cs="Arial"/>
+          <w:color w:val="000000"/>
+        </w:rPr>
+        <w:t xml:space="preserve"> dado un conjunto de ciudades que el usuario desea recorrer (por ejemplo, Madrid, París, Roma y Berlín), determinar en qué orden visitarlas para minimizar el costo total. Corresponde al Problema del Viajante (TSP), solicitado explícitamente por el enunciado como «programación dinámica estilo viajante».</w:t>
+      </w:r>
+    </w:p>
+    <w:p>
+      <w:pPr>
+        <w:spacing w:before="240" w:after="240" w:line="240" w:lineRule="auto"/>
+        <w:rPr>
+          <w:rFonts w:ascii="Arial" w:eastAsia="Arial" w:hAnsi="Arial" w:cs="Arial"/>
+          <w:color w:val="000000"/>
+        </w:rPr>
+      </w:pPr>
+      <w:r>
+        <w:rPr>
+          <w:rFonts w:ascii="Arial" w:eastAsia="Arial" w:hAnsi="Arial" w:cs="Arial"/>
+          <w:color w:val="000000"/>
+        </w:rPr>
+        <w:t xml:space="preserve">La diferencia resulta determinante porque la cantidad de órdenes posibles crece de forma factorial: fijada la ciudad de partida, un itinerario de n ciudades admite (n − 1)! recorridos distintos.</w:t>
+      </w:r>
+    </w:p>
+    <w:tbl>
+      <w:tblPr>
+        <w:tblW w:w="6000" w:type="dxa"/>
+        <w:jc w:val="center"/>
+        <w:tblBorders>
+          <w:top w:val="single" w:sz="4" w:space="0" w:color="808080"/>
+          <w:left w:val="single" w:sz="4" w:space="0" w:color="808080"/>
+          <w:bottom w:val="single" w:sz="4" w:space="0" w:color="808080"/>
+          <w:right w:val="single" w:sz="4" w:space="0" w:color="808080"/>
+          <w:insideH w:val="single" w:sz="4" w:space="0" w:color="808080"/>
+          <w:insideV w:val="single" w:sz="4" w:space="0" w:color="808080"/>
+        </w:tblBorders>
+        <w:tblCellMar>
+          <w:top w:w="60" w:type="dxa"/>
+          <w:left w:w="100" w:type="dxa"/>
+          <w:bottom w:w="60" w:type="dxa"/>
+          <w:right w:w="100" w:type="dxa"/>
+        </w:tblCellMar>
+      </w:tblPr>
+      <w:tblGrid>
+        <w:gridCol w:w="3000"/>
+        <w:gridCol w:w="3000"/>
+      </w:tblGrid>
+      <w:tr>
+        <w:trPr>
+          <w:tblHeader/>
+        </w:trPr>
+        <w:tc>
+          <w:tcPr>
+            <w:tcW w:w="3000" w:type="dxa"/>
+            <w:shd w:val="clear" w:color="auto" w:fill="D9D9D9"/>
+          </w:tcPr>
+          <w:p>
+            <w:pPr>
+              <w:spacing w:before="0" w:after="0" w:line="240" w:lineRule="auto"/>
+            </w:pPr>
+            <w:r>
+              <w:rPr>
+                <w:rFonts w:ascii="Arial" w:eastAsia="Arial" w:hAnsi="Arial" w:cs="Arial"/>
+                <w:b/>
+                <w:bCs/>
+                <w:color w:val="000000"/>
+                <w:sz w:val="20"/>
+                <w:szCs w:val="20"/>
+              </w:rPr>
+              <w:t xml:space="preserve">Cantidad de ciudades</w:t>
+            </w:r>
+          </w:p>
+        </w:tc>
+        <w:tc>
+          <w:tcPr>
+            <w:tcW w:w="3000" w:type="dxa"/>
+            <w:shd w:val="clear" w:color="auto" w:fill="D9D9D9"/>
+          </w:tcPr>
+          <w:p>
+            <w:pPr>
+              <w:spacing w:before="0" w:after="0" w:line="240" w:lineRule="auto"/>
+            </w:pPr>
+            <w:r>
+              <w:rPr>
+                <w:rFonts w:ascii="Arial" w:eastAsia="Arial" w:hAnsi="Arial" w:cs="Arial"/>
+                <w:b/>
+                <w:bCs/>
+                <w:color w:val="000000"/>
+                <w:sz w:val="20"/>
+                <w:szCs w:val="20"/>
+              </w:rPr>
+              <w:t xml:space="preserve">Órdenes posibles</w:t>
+            </w:r>
+          </w:p>
+        </w:tc>
+      </w:tr>
+      <w:tr>
+        <w:tc>
+          <w:tcPr>
+            <w:tcW w:w="3000" w:type="dxa"/>
+          </w:tcPr>
+          <w:p>
+            <w:pPr>
+              <w:spacing w:before="0" w:after="0" w:line="240" w:lineRule="auto"/>
+            </w:pPr>
+            <w:r>
+              <w:rPr>
+                <w:rFonts w:ascii="Arial" w:eastAsia="Arial" w:hAnsi="Arial" w:cs="Arial"/>
+                <w:color w:val="000000"/>
+                <w:sz w:val="20"/>
+                <w:szCs w:val="20"/>
+              </w:rPr>
+              <w:t xml:space="preserve">4</w:t>
+            </w:r>
+          </w:p>
+        </w:tc>
+        <w:tc>
+          <w:tcPr>
+            <w:tcW w:w="3000" w:type="dxa"/>
+          </w:tcPr>
+          <w:p>
+            <w:pPr>
+              <w:spacing w:before="0" w:after="0" w:line="240" w:lineRule="auto"/>
+            </w:pPr>
+            <w:r>
+              <w:rPr>
+                <w:rFonts w:ascii="Arial" w:eastAsia="Arial" w:hAnsi="Arial" w:cs="Arial"/>
+                <w:color w:val="000000"/>
+                <w:sz w:val="20"/>
+                <w:szCs w:val="20"/>
+              </w:rPr>
+              <w:t xml:space="preserve">6</w:t>
+            </w:r>
+          </w:p>
+        </w:tc>
+      </w:tr>
+      <w:tr>
+        <w:tc>
+          <w:tcPr>
+            <w:tcW w:w="3000" w:type="dxa"/>
+          </w:tcPr>
+          <w:p>
+            <w:pPr>
+              <w:spacing w:before="0" w:after="0" w:line="240" w:lineRule="auto"/>
+            </w:pPr>
+            <w:r>
+              <w:rPr>
+                <w:rFonts w:ascii="Arial" w:eastAsia="Arial" w:hAnsi="Arial" w:cs="Arial"/>
+                <w:color w:val="000000"/>
+                <w:sz w:val="20"/>
+                <w:szCs w:val="20"/>
+              </w:rPr>
+              <w:t xml:space="preserve">8</w:t>
+            </w:r>
+          </w:p>
+        </w:tc>
+        <w:tc>
+          <w:tcPr>
+            <w:tcW w:w="3000" w:type="dxa"/>
+          </w:tcPr>
+          <w:p>
+            <w:pPr>
+              <w:spacing w:before="0" w:after="0" w:line="240" w:lineRule="auto"/>
+            </w:pPr>
+            <w:r>
+              <w:rPr>
+                <w:rFonts w:ascii="Arial" w:eastAsia="Arial" w:hAnsi="Arial" w:cs="Arial"/>
+                <w:color w:val="000000"/>
+                <w:sz w:val="20"/>
+                <w:szCs w:val="20"/>
+              </w:rPr>
+              <w:t xml:space="preserve">5.040</w:t>
+            </w:r>
+          </w:p>
+        </w:tc>
+      </w:tr>
+      <w:tr>
+        <w:tc>
+          <w:tcPr>
+            <w:tcW w:w="3000" w:type="dxa"/>
+          </w:tcPr>
+          <w:p>
+            <w:pPr>
+              <w:spacing w:before="0" w:after="0" w:line="240" w:lineRule="auto"/>
+            </w:pPr>
+            <w:r>
+              <w:rPr>
+                <w:rFonts w:ascii="Arial" w:eastAsia="Arial" w:hAnsi="Arial" w:cs="Arial"/>
+                <w:color w:val="000000"/>
+                <w:sz w:val="20"/>
+                <w:szCs w:val="20"/>
+              </w:rPr>
+              <w:t xml:space="preserve">12</w:t>
+            </w:r>
+          </w:p>
+        </w:tc>
+        <w:tc>
+          <w:tcPr>
+            <w:tcW w:w="3000" w:type="dxa"/>
+          </w:tcPr>
+          <w:p>
+            <w:pPr>
+              <w:spacing w:before="0" w:after="0" w:line="240" w:lineRule="auto"/>
+            </w:pPr>
+            <w:r>
+              <w:rPr>
+                <w:rFonts w:ascii="Arial" w:eastAsia="Arial" w:hAnsi="Arial" w:cs="Arial"/>
+                <w:color w:val="000000"/>
+                <w:sz w:val="20"/>
+                <w:szCs w:val="20"/>
+              </w:rPr>
+              <w:t xml:space="preserve">≈ 40 millones</w:t>
+            </w:r>
+          </w:p>
+        </w:tc>
+      </w:tr>
+      <w:tr>
+        <w:tc>
+          <w:tcPr>
+            <w:tcW w:w="3000" w:type="dxa"/>
+          </w:tcPr>
+          <w:p>
+            <w:pPr>
+              <w:spacing w:before="0" w:after="0" w:line="240" w:lineRule="auto"/>
+            </w:pPr>
+            <w:r>
+              <w:rPr>
+                <w:rFonts w:ascii="Arial" w:eastAsia="Arial" w:hAnsi="Arial" w:cs="Arial"/>
+                <w:color w:val="000000"/>
+                <w:sz w:val="20"/>
+                <w:szCs w:val="20"/>
+              </w:rPr>
+              <w:t xml:space="preserve">20</w:t>
+            </w:r>
+          </w:p>
+        </w:tc>
+        <w:tc>
+          <w:tcPr>
+            <w:tcW w:w="3000" w:type="dxa"/>
+          </w:tcPr>
+          <w:p>
+            <w:pPr>
+              <w:spacing w:before="0" w:after="0" w:line="240" w:lineRule="auto"/>
+            </w:pPr>
+            <w:r>
+              <w:rPr>
+                <w:rFonts w:ascii="Arial" w:eastAsia="Arial" w:hAnsi="Arial" w:cs="Arial"/>
+                <w:color w:val="000000"/>
+                <w:sz w:val="20"/>
+                <w:szCs w:val="20"/>
+              </w:rPr>
+              <w:t xml:space="preserve">≈ 1,2 × 10¹⁷</w:t>
+            </w:r>
+          </w:p>
+        </w:tc>
+      </w:tr>
+    </w:tbl>
+    <w:p>
+      <w:pPr>
+        <w:spacing w:before="240" w:after="240" w:line="240" w:lineRule="auto"/>
+        <w:rPr>
+          <w:rFonts w:ascii="Arial" w:eastAsia="Arial" w:hAnsi="Arial" w:cs="Arial"/>
+          <w:color w:val="000000"/>
+        </w:rPr>
+      </w:pPr>
+      <w:r>
+        <w:rPr>
+          <w:rFonts w:ascii="Arial" w:eastAsia="Arial" w:hAnsi="Arial" w:cs="Arial"/>
+          <w:color w:val="000000"/>
+        </w:rPr>
+        <w:t xml:space="preserve">En consecuencia, el sistema emplea tres algoritmos, seleccionados según la cantidad de ciudades del itinerario:</w:t>
+      </w:r>
+    </w:p>
+    <w:tbl>
+      <w:tblPr>
+        <w:tblW w:w="9360" w:type="dxa"/>
+        <w:jc w:val="center"/>
+        <w:tblBorders>
+          <w:top w:val="single" w:sz="4" w:space="0" w:color="808080"/>
+          <w:left w:val="single" w:sz="4" w:space="0" w:color="808080"/>
+          <w:bottom w:val="single" w:sz="4" w:space="0" w:color="808080"/>
+          <w:right w:val="single" w:sz="4" w:space="0" w:color="808080"/>
+          <w:insideH w:val="single" w:sz="4" w:space="0" w:color="808080"/>
+          <w:insideV w:val="single" w:sz="4" w:space="0" w:color="808080"/>
+        </w:tblBorders>
+        <w:tblCellMar>
+          <w:top w:w="60" w:type="dxa"/>
+          <w:left w:w="100" w:type="dxa"/>
+          <w:bottom w:w="60" w:type="dxa"/>
+          <w:right w:w="100" w:type="dxa"/>
+        </w:tblCellMar>
+      </w:tblPr>
+      <w:tblGrid>
+        <w:gridCol w:w="1900"/>
+        <w:gridCol w:w="2400"/>
+        <w:gridCol w:w="5060"/>
+      </w:tblGrid>
+      <w:tr>
+        <w:trPr>
+          <w:tblHeader/>
+        </w:trPr>
+        <w:tc>
+          <w:tcPr>
+            <w:tcW w:w="1900" w:type="dxa"/>
+            <w:shd w:val="clear" w:color="auto" w:fill="D9D9D9"/>
+          </w:tcPr>
+          <w:p>
+            <w:pPr>
+              <w:spacing w:before="0" w:after="0" w:line="240" w:lineRule="auto"/>
+            </w:pPr>
+            <w:r>
+              <w:rPr>
+                <w:rFonts w:ascii="Arial" w:eastAsia="Arial" w:hAnsi="Arial" w:cs="Arial"/>
+                <w:b/>
+                <w:bCs/>
+                <w:color w:val="000000"/>
+                <w:sz w:val="20"/>
+                <w:szCs w:val="20"/>
+              </w:rPr>
+              <w:t xml:space="preserve">Cantidad de ciudades</w:t>
+            </w:r>
+          </w:p>
+        </w:tc>
+        <w:tc>
+          <w:tcPr>
+            <w:tcW w:w="2400" w:type="dxa"/>
+            <w:shd w:val="clear" w:color="auto" w:fill="D9D9D9"/>
+          </w:tcPr>
+          <w:p>
+            <w:pPr>
+              <w:spacing w:before="0" w:after="0" w:line="240" w:lineRule="auto"/>
+            </w:pPr>
+            <w:r>
+              <w:rPr>
+                <w:rFonts w:ascii="Arial" w:eastAsia="Arial" w:hAnsi="Arial" w:cs="Arial"/>
+                <w:b/>
+                <w:bCs/>
+                <w:color w:val="000000"/>
+                <w:sz w:val="20"/>
+                <w:szCs w:val="20"/>
+              </w:rPr>
+              <w:t xml:space="preserve">Algoritmo</w:t>
+            </w:r>
+          </w:p>
+        </w:tc>
+        <w:tc>
+          <w:tcPr>
+            <w:tcW w:w="5060" w:type="dxa"/>
+            <w:shd w:val="clear" w:color="auto" w:fill="D9D9D9"/>
+          </w:tcPr>
+          <w:p>
+            <w:pPr>
+              <w:spacing w:before="0" w:after="0" w:line="240" w:lineRule="auto"/>
+            </w:pPr>
+            <w:r>
+              <w:rPr>
+                <w:rFonts w:ascii="Arial" w:eastAsia="Arial" w:hAnsi="Arial" w:cs="Arial"/>
+                <w:b/>
+                <w:bCs/>
+                <w:color w:val="000000"/>
+                <w:sz w:val="20"/>
+                <w:szCs w:val="20"/>
+              </w:rPr>
+              <w:t xml:space="preserve">Justificación</w:t>
+            </w:r>
+          </w:p>
+        </w:tc>
+      </w:tr>
+      <w:tr>
+        <w:tc>
+          <w:tcPr>
+            <w:tcW w:w="1900" w:type="dxa"/>
+          </w:tcPr>
+          <w:p>
+            <w:pPr>
+              <w:spacing w:before="0" w:after="0" w:line="240" w:lineRule="auto"/>
+            </w:pPr>
+            <w:r>
+              <w:rPr>
+                <w:rFonts w:ascii="Arial" w:eastAsia="Arial" w:hAnsi="Arial" w:cs="Arial"/>
+                <w:color w:val="000000"/>
+                <w:sz w:val="20"/>
+                <w:szCs w:val="20"/>
+              </w:rPr>
+              <w:t xml:space="preserve">2</w:t>
+            </w:r>
+          </w:p>
+        </w:tc>
+        <w:tc>
+          <w:tcPr>
+            <w:tcW w:w="2400" w:type="dxa"/>
+          </w:tcPr>
+          <w:p>
+            <w:pPr>
+              <w:spacing w:before="0" w:after="0" w:line="240" w:lineRule="auto"/>
+            </w:pPr>
+            <w:r>
+              <w:rPr>
+                <w:rFonts w:ascii="Arial" w:eastAsia="Arial" w:hAnsi="Arial" w:cs="Arial"/>
+                <w:color w:val="000000"/>
+                <w:sz w:val="20"/>
+                <w:szCs w:val="20"/>
+              </w:rPr>
+              <w:t xml:space="preserve">Dijkstra (sección 4.2)</w:t>
+            </w:r>
+          </w:p>
+        </w:tc>
+        <w:tc>
+          <w:tcPr>
+            <w:tcW w:w="5060" w:type="dxa"/>
+          </w:tcPr>
+          <w:p>
+            <w:pPr>
+              <w:spacing w:before="0" w:after="0" w:line="240" w:lineRule="auto"/>
+            </w:pPr>
+            <w:r>
+              <w:rPr>
+                <w:rFonts w:ascii="Arial" w:eastAsia="Arial" w:hAnsi="Arial" w:cs="Arial"/>
+                <w:color w:val="000000"/>
+                <w:sz w:val="20"/>
+                <w:szCs w:val="20"/>
+              </w:rPr>
+              <w:t xml:space="preserve">Se trata de un camino mínimo; no existe un orden que optimizar.</w:t>
+            </w:r>
+          </w:p>
+        </w:tc>
+      </w:tr>
+      <w:tr>
+        <w:tc>
+          <w:tcPr>
+            <w:tcW w:w="1900" w:type="dxa"/>
+          </w:tcPr>
+          <w:p>
+            <w:pPr>
+              <w:spacing w:before="0" w:after="0" w:line="240" w:lineRule="auto"/>
+            </w:pPr>
+            <w:r>
+              <w:rPr>
+                <w:rFonts w:ascii="Arial" w:eastAsia="Arial" w:hAnsi="Arial" w:cs="Arial"/>
+                <w:color w:val="000000"/>
+                <w:sz w:val="20"/>
+                <w:szCs w:val="20"/>
+              </w:rPr>
+              <w:t xml:space="preserve">3 a 12</w:t>
+            </w:r>
+          </w:p>
+        </w:tc>
+        <w:tc>
+          <w:tcPr>
+            <w:tcW w:w="2400" w:type="dxa"/>
+          </w:tcPr>
+          <w:p>
+            <w:pPr>
+              <w:spacing w:before="0" w:after="0" w:line="240" w:lineRule="auto"/>
+            </w:pPr>
+            <w:r>
+              <w:rPr>
+                <w:rFonts w:ascii="Arial" w:eastAsia="Arial" w:hAnsi="Arial" w:cs="Arial"/>
+                <w:color w:val="000000"/>
+                <w:sz w:val="20"/>
+                <w:szCs w:val="20"/>
+              </w:rPr>
+              <w:t xml:space="preserve">Held-Karp (sección 4.3)</w:t>
+            </w:r>
+          </w:p>
+        </w:tc>
+        <w:tc>
+          <w:tcPr>
+            <w:tcW w:w="5060" w:type="dxa"/>
+          </w:tcPr>
+          <w:p>
+            <w:pPr>
+              <w:spacing w:before="0" w:after="0" w:line="240" w:lineRule="auto"/>
+            </w:pPr>
+            <w:r>
+              <w:rPr>
+                <w:rFonts w:ascii="Arial" w:eastAsia="Arial" w:hAnsi="Arial" w:cs="Arial"/>
+                <w:color w:val="000000"/>
+                <w:sz w:val="20"/>
+                <w:szCs w:val="20"/>
+              </w:rPr>
+              <w:t xml:space="preserve">Solución exacta. La programación dinámica evita enumerar todos los órdenes, aunque su costo crece como O(n² · 2ⁿ).</w:t>
+            </w:r>
+          </w:p>
+        </w:tc>
+      </w:tr>
+      <w:tr>
+        <w:tc>
+          <w:tcPr>
+            <w:tcW w:w="1900" w:type="dxa"/>
+          </w:tcPr>
+          <w:p>
+            <w:pPr>
+              <w:spacing w:before="0" w:after="0" w:line="240" w:lineRule="auto"/>
+            </w:pPr>
+            <w:r>
+              <w:rPr>
+                <w:rFonts w:ascii="Arial" w:eastAsia="Arial" w:hAnsi="Arial" w:cs="Arial"/>
+                <w:color w:val="000000"/>
+                <w:sz w:val="20"/>
+                <w:szCs w:val="20"/>
+              </w:rPr>
+              <w:t xml:space="preserve">13 o más</w:t>
+            </w:r>
+          </w:p>
+        </w:tc>
+        <w:tc>
+          <w:tcPr>
+            <w:tcW w:w="2400" w:type="dxa"/>
+          </w:tcPr>
+          <w:p>
+            <w:pPr>
+              <w:spacing w:before="0" w:after="0" w:line="240" w:lineRule="auto"/>
+            </w:pPr>
+            <w:r>
+              <w:rPr>
+                <w:rFonts w:ascii="Arial" w:eastAsia="Arial" w:hAnsi="Arial" w:cs="Arial"/>
+                <w:color w:val="000000"/>
+                <w:sz w:val="20"/>
+                <w:szCs w:val="20"/>
+              </w:rPr>
+              <w:t xml:space="preserve">Algoritmo genético (sección 4.4)</w:t>
+            </w:r>
+          </w:p>
+        </w:tc>
+        <w:tc>
+          <w:tcPr>
+            <w:tcW w:w="5060" w:type="dxa"/>
+          </w:tcPr>
+          <w:p>
+            <w:pPr>
+              <w:spacing w:before="0" w:after="0" w:line="240" w:lineRule="auto"/>
+            </w:pPr>
+            <w:r>
+              <w:rPr>
+                <w:rFonts w:ascii="Arial" w:eastAsia="Arial" w:hAnsi="Arial" w:cs="Arial"/>
+                <w:color w:val="000000"/>
+                <w:sz w:val="20"/>
+                <w:szCs w:val="20"/>
+              </w:rPr>
+              <w:t xml:space="preserve">Held-Karp deja de ser viable en tiempo interactivo. El genético obtiene una solución de alta calidad, sin garantía de optimalidad, en un tiempo acotado.</w:t>
+            </w:r>
+          </w:p>
+        </w:tc>
+      </w:tr>
+    </w:tbl>
+    <w:p>
+      <w:pPr>
+        <w:spacing w:before="240" w:after="240" w:line="240" w:lineRule="auto"/>
+        <w:rPr>
+          <w:rFonts w:ascii="Arial" w:eastAsia="Arial" w:hAnsi="Arial" w:cs="Arial"/>
+          <w:color w:val="000000"/>
+        </w:rPr>
+      </w:pPr>
+      <w:r>
+        <w:rPr>
+          <w:rFonts w:ascii="Arial" w:eastAsia="Arial" w:hAnsi="Arial" w:cs="Arial"/>
+          <w:color w:val="000000"/>
+        </w:rPr>
+        <w:t xml:space="preserve">En síntesis: Dijkstra determina cómo desplazarse de una ciudad a otra, mientras que el TSP determina en qué orden recorrer todas. El algoritmo genético se incorpora porque, a partir de cierto tamaño, calcular el orden exacto deja de ser factible en un tiempo razonable.</w:t>
+      </w:r>
+    </w:p>
+    <w:p>
+      <w:pPr>
+        <w:pStyle w:val="Ttulo3"/>
+        <w:spacing w:before="280" w:after="80"/>
+        <w:jc w:val="left"/>
+        <w:rPr>
+          <w:rFonts w:ascii="Arial" w:eastAsia="Arial" w:hAnsi="Arial" w:cs="Arial"/>
+          <w:color w:val="000000"/>
+          <w:sz w:val="26"/>
+          <w:szCs w:val="26"/>
+        </w:rPr>
+      </w:pPr>
       <w:bookmarkStart w:id="7" w:name="_by9sfe5s3rng" w:colFirst="0" w:colLast="0"/>
       <w:bookmarkEnd w:id="7"/>
       <w:r>
@@ -1117,7 +1735,7 @@
           <w:sz w:val="26"/>
           <w:szCs w:val="26"/>
         </w:rPr>
-        <w:t>4.1. Optimización de Rutas (Dijkstra)</w:t>
+        <w:t>4.2. Optimización de Rutas (Dijkstra)</w:t>
       </w:r>
     </w:p>
     <w:p>
@@ -1286,7 +1904,7 @@
           <w:sz w:val="26"/>
           <w:szCs w:val="26"/>
         </w:rPr>
-        <w:t>4.2. Optimización Multidestino (</w:t>
+        <w:t>4.3. Optimización Multidestino (</w:t>
       </w:r>
       <w:r>
         <w:rPr>
@@ -1472,85 +2090,14 @@
           <w:bCs/>
           <w:color w:val="000000"/>
         </w:rPr>
-        <w:t>Complejidad Computacional:</w:t>
-      </w:r>
-      <w:r>
-        <w:rPr>
-          <w:rFonts w:ascii="Arial" w:eastAsia="Arial" w:hAnsi="Arial" w:cs="Arial"/>
-          <w:color w:val="000000"/>
-        </w:rPr>
-        <w:t xml:space="preserve"> Se logró </w:t>
-      </w:r>
-      <w:r>
-        <w:rPr>
-          <w:rFonts w:ascii="Arial" w:eastAsia="Arial" w:hAnsi="Arial" w:cs="Arial"/>
-          <w:color w:val="000000"/>
-        </w:rPr>
-        <w:t>reducir la complejidad factorial $O(n!)$, propia de la fuerza bruta, a una complejidad exponencial de $O(n^2 \cdot 2^n)$, haciendo</w:t>
-      </w:r>
-      <w:r>
-        <w:rPr>
-          <w:rFonts w:ascii="Arial" w:eastAsia="Arial" w:hAnsi="Arial" w:cs="Arial"/>
-          <w:color w:val="000000"/>
-        </w:rPr>
-        <w:t xml:space="preserve"> </w:t>
-      </w:r>
-      <w:r>
-        <w:rPr>
-          <w:rFonts w:ascii="Arial" w:eastAsia="Arial" w:hAnsi="Arial" w:cs="Arial"/>
-          <w:color w:val="000000"/>
-        </w:rPr>
-        <w:t>viable la resolución exacta para instancias de hasta 20 ciudades.</w:t>
-      </w:r>
-    </w:p>
-    <w:p>
-      <w:pPr>
-        <w:pStyle w:val="Ttulo2"/>
-        <w:spacing w:before="360" w:after="80"/>
-        <w:rPr>
-          <w:rFonts w:ascii="Arial" w:eastAsia="Arial" w:hAnsi="Arial" w:cs="Arial"/>
-          <w:b/>
-          <w:bCs/>
-          <w:color w:val="000000"/>
-          <w:sz w:val="34"/>
-          <w:szCs w:val="34"/>
-        </w:rPr>
-      </w:pPr>
-      <w:bookmarkStart w:id="9" w:name="_johtedk29wvf" w:colFirst="0" w:colLast="0"/>
-      <w:bookmarkEnd w:id="9"/>
-      <w:r>
-        <w:rPr>
-          <w:rFonts w:ascii="Arial" w:eastAsia="Arial" w:hAnsi="Arial" w:cs="Arial"/>
-          <w:b/>
-          <w:bCs/>
-          <w:color w:val="000000"/>
-          <w:sz w:val="34"/>
-          <w:szCs w:val="34"/>
-        </w:rPr>
-        <w:t>5. Inteligencia Artificial y Aprendizaje Continuo</w:t>
-      </w:r>
-    </w:p>
-    <w:p>
-      <w:pPr>
-        <w:spacing w:before="240" w:after="240" w:line="240" w:lineRule="auto"/>
-        <w:rPr>
-          <w:rFonts w:ascii="Arial" w:eastAsia="Arial" w:hAnsi="Arial" w:cs="Arial"/>
-          <w:color w:val="000000"/>
-        </w:rPr>
-      </w:pPr>
-      <w:r>
-        <w:rPr>
-          <w:rFonts w:ascii="Arial" w:eastAsia="Arial" w:hAnsi="Arial" w:cs="Arial"/>
-          <w:color w:val="000000"/>
-        </w:rPr>
-        <w:t>El sistem</w:t>
-      </w:r>
-      <w:r>
-        <w:rPr>
-          <w:rFonts w:ascii="Arial" w:eastAsia="Arial" w:hAnsi="Arial" w:cs="Arial"/>
-          <w:color w:val="000000"/>
-        </w:rPr>
-        <w:t>a incorpora un motor de recomendaciones dinámico y adaptativo que evoluciona con el uso continuado por parte del usuario.</w:t>
+        <w:t xml:space="preserve">Complejidad Computacional:</w:t>
+      </w:r>
+      <w:r>
+        <w:rPr>
+          <w:rFonts w:ascii="Arial" w:eastAsia="Arial" w:hAnsi="Arial" w:cs="Arial"/>
+          <w:color w:val="000000"/>
+        </w:rPr>
+        <w:t xml:space="preserve"> Se logró reducir la complejidad factorial O(n!), propia de la fuerza bruta, a una complejidad exponencial de O(n² · 2ⁿ). En la práctica, esto permite resolver de forma exacta y en tiempo interactivo itinerarios de hasta 12 ciudades (aproximadamente 590.000 operaciones); por encima de ese umbral el sistema recurre al algoritmo genético descrito en la sección 4.4.</w:t>
       </w:r>
     </w:p>
     <w:p>
@@ -1565,8 +2112,6 @@
           <w:szCs w:val="26"/>
         </w:rPr>
       </w:pPr>
-      <w:bookmarkStart w:id="10" w:name="_vnrnerrri20o" w:colFirst="0" w:colLast="0"/>
-      <w:bookmarkEnd w:id="10"/>
       <w:r>
         <w:rPr>
           <w:rFonts w:ascii="Arial" w:eastAsia="Arial" w:hAnsi="Arial" w:cs="Arial"/>
@@ -1574,7 +2119,7 @@
           <w:sz w:val="26"/>
           <w:szCs w:val="26"/>
         </w:rPr>
-        <w:t>5.1. Sistema Híbrido de Recomendación</w:t>
+        <w:t xml:space="preserve">4.4. Optimización Multidestino a Gran Escala (Algoritmo Genético)</w:t>
       </w:r>
     </w:p>
     <w:p>
@@ -1590,21 +2135,14 @@
           <w:rFonts w:ascii="Arial" w:eastAsia="Arial" w:hAnsi="Arial" w:cs="Arial"/>
           <w:color w:val="000000"/>
         </w:rPr>
-        <w:t>Con el fin de maximizar la precisión de las sugerencias y mitigar el problema del "arranque en f</w:t>
-      </w:r>
-      <w:r>
-        <w:rPr>
-          <w:rFonts w:ascii="Arial" w:eastAsia="Arial" w:hAnsi="Arial" w:cs="Arial"/>
-          <w:color w:val="000000"/>
-        </w:rPr>
-        <w:t>río" (cold start) para usuarios nuevos, se combinaron tres estrategias complementarias:</w:t>
+        <w:t xml:space="preserve">Para itinerarios de más de 12 ciudades se implementó un algoritmo genético (clase GeneticTSP, módulo tsp_genetic.py), una metaheurística poblacional que resuelve el mismo problema del viajante sin la explosión exponencial de Held-Karp.</w:t>
       </w:r>
     </w:p>
     <w:p>
       <w:pPr>
         <w:numPr>
           <w:ilvl w:val="0"/>
-          <w:numId w:val="12"/>
+          <w:numId w:val="2"/>
         </w:numPr>
         <w:spacing w:before="240" w:line="240" w:lineRule="auto"/>
         <w:rPr>
@@ -1618,44 +2156,21 @@
           <w:bCs/>
           <w:color w:val="000000"/>
         </w:rPr>
-        <w:t>Filtro</w:t>
-      </w:r>
-      <w:r>
-        <w:rPr>
-          <w:rFonts w:ascii="Arial" w:eastAsia="Arial" w:hAnsi="Arial" w:cs="Arial"/>
-          <w:color w:val="000000"/>
-        </w:rPr>
-        <w:t xml:space="preserve"> Colaborativo (Basado</w:t>
-      </w:r>
-      <w:r>
-        <w:rPr>
-          <w:rFonts w:ascii="Arial" w:eastAsia="Arial" w:hAnsi="Arial" w:cs="Arial"/>
-          <w:b/>
-          <w:bCs/>
-          <w:color w:val="000000"/>
-        </w:rPr>
-        <w:t xml:space="preserve"> en el Usuario):</w:t>
-      </w:r>
-      <w:r>
-        <w:rPr>
-          <w:rFonts w:ascii="Arial" w:eastAsia="Arial" w:hAnsi="Arial" w:cs="Arial"/>
-          <w:color w:val="000000"/>
-        </w:rPr>
-        <w:t xml:space="preserve"> Emplea similitud de coseno sobre la matriz dispersa de calificaciones usuario-destino para identificar usuarios con patrones</w:t>
-      </w:r>
-      <w:r>
-        <w:rPr>
-          <w:rFonts w:ascii="Arial" w:eastAsia="Arial" w:hAnsi="Arial" w:cs="Arial"/>
-          <w:color w:val="000000"/>
-        </w:rPr>
-        <w:t xml:space="preserve"> de preferencias similares y recomendar ítems exitosos en vecindarios afines.</w:t>
+        <w:t xml:space="preserve">Codificación:</w:t>
+      </w:r>
+      <w:r>
+        <w:rPr>
+          <w:rFonts w:ascii="Arial" w:eastAsia="Arial" w:hAnsi="Arial" w:cs="Arial"/>
+          <w:color w:val="000000"/>
+        </w:rPr>
+        <w:t xml:space="preserve"> cada individuo (cromosoma) es una permutación de los índices de las ciudades; por ejemplo, [0, 3, 1, 2] representa el recorrido Madrid → Viena → Barcelona → Roma → Madrid. La aptitud (fitness) de un individuo es inversamente proporcional al costo total del recorrido.</w:t>
       </w:r>
     </w:p>
     <w:p>
       <w:pPr>
         <w:numPr>
           <w:ilvl w:val="0"/>
-          <w:numId w:val="12"/>
+          <w:numId w:val="2"/>
         </w:numPr>
         <w:spacing w:before="0" w:line="240" w:lineRule="auto"/>
         <w:rPr>
@@ -1669,37 +2184,105 @@
           <w:bCs/>
           <w:color w:val="000000"/>
         </w:rPr>
-        <w:t>Filtro</w:t>
-      </w:r>
-      <w:r>
-        <w:rPr>
-          <w:rFonts w:ascii="Arial" w:eastAsia="Arial" w:hAnsi="Arial" w:cs="Arial"/>
-          <w:color w:val="000000"/>
-        </w:rPr>
-        <w:t xml:space="preserve"> Basado en</w:t>
-      </w:r>
-      <w:r>
-        <w:rPr>
-          <w:rFonts w:ascii="Arial" w:eastAsia="Arial" w:hAnsi="Arial" w:cs="Arial"/>
-          <w:b/>
-          <w:bCs/>
-          <w:color w:val="000000"/>
-        </w:rPr>
-        <w:t xml:space="preserve"> Contenido (Content-Based):</w:t>
-      </w:r>
-      <w:r>
-        <w:rPr>
-          <w:rFonts w:ascii="Arial" w:eastAsia="Arial" w:hAnsi="Arial" w:cs="Arial"/>
-          <w:color w:val="000000"/>
-        </w:rPr>
-        <w:t xml:space="preserve"> Construye perfiles vectoriales de los ítems y de los usuarios, comparando el vector de preferencias explícitas del usuario con el vector de características latentes de los destinos.</w:t>
+        <w:t xml:space="preserve">Selección por torneo:</w:t>
+      </w:r>
+      <w:r>
+        <w:rPr>
+          <w:rFonts w:ascii="Arial" w:eastAsia="Arial" w:hAnsi="Arial" w:cs="Arial"/>
+          <w:color w:val="000000"/>
+        </w:rPr>
+        <w:t xml:space="preserve"> se eligen cinco individuos al azar y se conserva el de menor costo como progenitor, favoreciendo las buenas soluciones sin eliminar por completo la diversidad de la población.</w:t>
       </w:r>
     </w:p>
     <w:p>
       <w:pPr>
         <w:numPr>
           <w:ilvl w:val="0"/>
-          <w:numId w:val="12"/>
+          <w:numId w:val="2"/>
+        </w:numPr>
+        <w:spacing w:before="0" w:line="240" w:lineRule="auto"/>
+        <w:rPr>
+          <w:color w:val="000000"/>
+        </w:rPr>
+      </w:pPr>
+      <w:r>
+        <w:rPr>
+          <w:rFonts w:ascii="Arial" w:eastAsia="Arial" w:hAnsi="Arial" w:cs="Arial"/>
+          <w:b/>
+          <w:bCs/>
+          <w:color w:val="000000"/>
+        </w:rPr>
+        <w:t xml:space="preserve">Cruce por orden (Order Crossover, OX):</w:t>
+      </w:r>
+      <w:r>
+        <w:rPr>
+          <w:rFonts w:ascii="Arial" w:eastAsia="Arial" w:hAnsi="Arial" w:cs="Arial"/>
+          <w:color w:val="000000"/>
+        </w:rPr>
+        <w:t xml:space="preserve"> el descendiente hereda un segmento de un progenitor y completa el resto respetando el orden relativo del otro. A diferencia de un cruce convencional, este operador garantiza que el resultado siga siendo una permutación válida, sin ciudades repetidas ni omitidas.</w:t>
+      </w:r>
+    </w:p>
+    <w:p>
+      <w:pPr>
+        <w:numPr>
+          <w:ilvl w:val="0"/>
+          <w:numId w:val="2"/>
+        </w:numPr>
+        <w:spacing w:before="0" w:line="240" w:lineRule="auto"/>
+        <w:rPr>
+          <w:color w:val="000000"/>
+        </w:rPr>
+      </w:pPr>
+      <w:r>
+        <w:rPr>
+          <w:rFonts w:ascii="Arial" w:eastAsia="Arial" w:hAnsi="Arial" w:cs="Arial"/>
+          <w:b/>
+          <w:bCs/>
+          <w:color w:val="000000"/>
+        </w:rPr>
+        <w:t xml:space="preserve">Mutación por intercambio:</w:t>
+      </w:r>
+      <w:r>
+        <w:rPr>
+          <w:rFonts w:ascii="Arial" w:eastAsia="Arial" w:hAnsi="Arial" w:cs="Arial"/>
+          <w:color w:val="000000"/>
+        </w:rPr>
+        <w:t xml:space="preserve"> con una probabilidad del 2 % se intercambian dos ciudades del recorrido, lo que introduce variación y permite escapar de óptimos locales.</w:t>
+      </w:r>
+    </w:p>
+    <w:p>
+      <w:pPr>
+        <w:numPr>
+          <w:ilvl w:val="0"/>
+          <w:numId w:val="2"/>
+        </w:numPr>
+        <w:spacing w:before="0" w:line="240" w:lineRule="auto"/>
+        <w:rPr>
+          <w:color w:val="000000"/>
+        </w:rPr>
+      </w:pPr>
+      <w:r>
+        <w:rPr>
+          <w:rFonts w:ascii="Arial" w:eastAsia="Arial" w:hAnsi="Arial" w:cs="Arial"/>
+          <w:b/>
+          <w:bCs/>
+          <w:color w:val="000000"/>
+        </w:rPr>
+        <w:t xml:space="preserve">Elitismo:</w:t>
+      </w:r>
+      <w:r>
+        <w:rPr>
+          <w:rFonts w:ascii="Arial" w:eastAsia="Arial" w:hAnsi="Arial" w:cs="Arial"/>
+          <w:color w:val="000000"/>
+        </w:rPr>
+        <w:t xml:space="preserve"> los dos mejores individuos de cada generación pasan intactos a la siguiente, de modo que la mejor solución encontrada nunca se pierde.</w:t>
+      </w:r>
+    </w:p>
+    <w:p>
+      <w:pPr>
+        <w:numPr>
+          <w:ilvl w:val="0"/>
+          <w:numId w:val="2"/>
         </w:numPr>
         <w:spacing w:before="0" w:after="240" w:line="240" w:lineRule="auto"/>
         <w:rPr>
@@ -1713,45 +2296,73 @@
           <w:bCs/>
           <w:color w:val="000000"/>
         </w:rPr>
-        <w:t>Filtro Basado en Texto (NLP):</w:t>
-      </w:r>
-      <w:r>
-        <w:rPr>
-          <w:rFonts w:ascii="Arial" w:eastAsia="Arial" w:hAnsi="Arial" w:cs="Arial"/>
-          <w:color w:val="000000"/>
-        </w:rPr>
-        <w:t xml:space="preserve"> Aplica técnicas de Procesamiento de Lenguaje Natural, </w:t>
-      </w:r>
-      <w:r>
-        <w:rPr>
-          <w:rFonts w:ascii="Arial" w:eastAsia="Arial" w:hAnsi="Arial" w:cs="Arial"/>
-          <w:color w:val="000000"/>
-        </w:rPr>
-        <w:lastRenderedPageBreak/>
-        <w:t xml:space="preserve">específicamente </w:t>
-      </w:r>
-      <w:r>
-        <w:rPr>
-          <w:rFonts w:ascii="Arial" w:eastAsia="Arial" w:hAnsi="Arial" w:cs="Arial"/>
-          <w:b/>
-          <w:bCs/>
-          <w:color w:val="000000"/>
-        </w:rPr>
-        <w:t>TF-IDF</w:t>
-      </w:r>
-      <w:r>
-        <w:rPr>
-          <w:rFonts w:ascii="Arial" w:eastAsia="Arial" w:hAnsi="Arial" w:cs="Arial"/>
-          <w:color w:val="000000"/>
-        </w:rPr>
-        <w:t xml:space="preserve"> (Term Frequency-Inverse Document Frequency), sobre las descripciones textuales de los destinos para habilitar búsquedas semánticas y recomendaciones basadas en la relevancia de p</w:t>
-      </w:r>
-      <w:r>
-        <w:rPr>
-          <w:rFonts w:ascii="Arial" w:eastAsia="Arial" w:hAnsi="Arial" w:cs="Arial"/>
-          <w:color w:val="000000"/>
-        </w:rPr>
-        <w:t>alabras clave.</w:t>
+        <w:t xml:space="preserve">Complejidad Computacional:</w:t>
+      </w:r>
+      <w:r>
+        <w:rPr>
+          <w:rFonts w:ascii="Arial" w:eastAsia="Arial" w:hAnsi="Arial" w:cs="Arial"/>
+          <w:color w:val="000000"/>
+        </w:rPr>
+        <w:t xml:space="preserve"> O(g · p · n), donde g es la cantidad de generaciones, p el tamaño de la población y n la cantidad de ciudades. El costo crece de forma lineal con n, en lugar de exponencial.</w:t>
+      </w:r>
+    </w:p>
+    <w:p>
+      <w:pPr>
+        <w:spacing w:before="240" w:after="240" w:line="240" w:lineRule="auto"/>
+        <w:rPr>
+          <w:rFonts w:ascii="Arial" w:eastAsia="Arial" w:hAnsi="Arial" w:cs="Arial"/>
+          <w:color w:val="000000"/>
+        </w:rPr>
+      </w:pPr>
+      <w:r>
+        <w:rPr>
+          <w:rFonts w:ascii="Arial" w:eastAsia="Arial" w:hAnsi="Arial" w:cs="Arial"/>
+          <w:color w:val="000000"/>
+        </w:rPr>
+        <w:t xml:space="preserve">Como contrapartida, el algoritmo genético no garantiza la solución óptima. Para acotar ese riesgo se desarrollaron pruebas automatizadas (test_tsp_genetic.py) que verifican que el resultado sea siempre una permutación válida, que la ejecución sea reproducible con una semilla fija, que la mejor solución no empeore entre generaciones y que, en instancias pequeñas, alcance el mismo óptimo que calcula Held-Karp.</w:t>
+      </w:r>
+    </w:p>
+    <w:p>
+      <w:pPr>
+        <w:pStyle w:val="Ttulo2"/>
+        <w:spacing w:before="360" w:after="80"/>
+        <w:rPr>
+          <w:rFonts w:ascii="Arial" w:eastAsia="Arial" w:hAnsi="Arial" w:cs="Arial"/>
+          <w:b/>
+          <w:bCs/>
+          <w:color w:val="000000"/>
+          <w:sz w:val="34"/>
+          <w:szCs w:val="34"/>
+        </w:rPr>
+      </w:pPr>
+      <w:bookmarkStart w:id="9" w:name="_johtedk29wvf" w:colFirst="0" w:colLast="0"/>
+      <w:bookmarkEnd w:id="9"/>
+      <w:r>
+        <w:rPr>
+          <w:rFonts w:ascii="Arial" w:eastAsia="Arial" w:hAnsi="Arial" w:cs="Arial"/>
+          <w:b/>
+          <w:bCs/>
+          <w:color w:val="000000"/>
+          <w:sz w:val="34"/>
+          <w:szCs w:val="34"/>
+        </w:rPr>
+        <w:t xml:space="preserve">5. Inteligencia Artificial: Recomendaciones con Google Gemini</w:t>
+      </w:r>
+    </w:p>
+    <w:p>
+      <w:pPr>
+        <w:spacing w:before="240" w:after="240" w:line="240" w:lineRule="auto"/>
+        <w:rPr>
+          <w:rFonts w:ascii="Arial" w:eastAsia="Arial" w:hAnsi="Arial" w:cs="Arial"/>
+          <w:color w:val="000000"/>
+        </w:rPr>
+      </w:pPr>
+      <w:r>
+        <w:rPr>
+          <w:rFonts w:ascii="Arial" w:eastAsia="Arial" w:hAnsi="Arial" w:cs="Arial"/>
+          <w:color w:val="000000"/>
+        </w:rPr>
+        <w:t xml:space="preserve">El sistema incorpora un modelo de lenguaje de gran escala (LLM), Google Gemini, para enriquecer el itinerario con información que los algoritmos de optimización no pueden producir: qué conviene visitar en cada ciudad del recorrido. La optimización decide en qué orden viajar; la IA aporta el contenido turístico de cada destino.</w:t>
       </w:r>
     </w:p>
     <w:p>
@@ -1766,8 +2377,6 @@
           <w:szCs w:val="26"/>
         </w:rPr>
       </w:pPr>
-      <w:bookmarkStart w:id="11" w:name="_mqghstkd2kah" w:colFirst="0" w:colLast="0"/>
-      <w:bookmarkEnd w:id="11"/>
       <w:r>
         <w:rPr>
           <w:rFonts w:ascii="Arial" w:eastAsia="Arial" w:hAnsi="Arial" w:cs="Arial"/>
@@ -1775,46 +2384,14 @@
           <w:sz w:val="26"/>
           <w:szCs w:val="26"/>
         </w:rPr>
-        <w:t>5.2. Algoritmo de Aprendizaje (Aprendizaje en Línea)</w:t>
-      </w:r>
-    </w:p>
-    <w:p>
-      <w:pPr>
-        <w:spacing w:before="240" w:after="240" w:line="240" w:lineRule="auto"/>
-        <w:rPr>
-          <w:rFonts w:ascii="Arial" w:eastAsia="Arial" w:hAnsi="Arial" w:cs="Arial"/>
-          <w:color w:val="000000"/>
-        </w:rPr>
-      </w:pPr>
-      <w:r>
-        <w:rPr>
-          <w:rFonts w:ascii="Arial" w:eastAsia="Arial" w:hAnsi="Arial" w:cs="Arial"/>
-          <w:color w:val="000000"/>
-        </w:rPr>
-        <w:t>Se implementó un mecanismo sofisticado para la actualización del perfil de usuario en tiempo real, basado en el concepto de aprendizaje en línea (</w:t>
-      </w:r>
-      <w:r>
-        <w:rPr>
-          <w:rFonts w:ascii="Arial" w:eastAsia="Arial" w:hAnsi="Arial" w:cs="Arial"/>
-          <w:i/>
-          <w:iCs/>
-          <w:color w:val="000000"/>
-        </w:rPr>
-        <w:t>Online Learning</w:t>
-      </w:r>
-      <w:r>
-        <w:rPr>
-          <w:rFonts w:ascii="Arial" w:eastAsia="Arial" w:hAnsi="Arial" w:cs="Arial"/>
-          <w:color w:val="000000"/>
-        </w:rPr>
-        <w:t>).</w:t>
+        <w:t xml:space="preserve">5.1. Funcionamiento</w:t>
       </w:r>
     </w:p>
     <w:p>
       <w:pPr>
         <w:numPr>
           <w:ilvl w:val="0"/>
-          <w:numId w:val="10"/>
+          <w:numId w:val="2"/>
         </w:numPr>
         <w:spacing w:before="240" w:line="240" w:lineRule="auto"/>
         <w:rPr>
@@ -1828,28 +2405,21 @@
           <w:bCs/>
           <w:color w:val="000000"/>
         </w:rPr>
-        <w:t>Detonante:</w:t>
-      </w:r>
-      <w:r>
-        <w:rPr>
-          <w:rFonts w:ascii="Arial" w:eastAsia="Arial" w:hAnsi="Arial" w:cs="Arial"/>
-          <w:color w:val="000000"/>
-        </w:rPr>
-        <w:t xml:space="preserve"> La confirmaci</w:t>
-      </w:r>
-      <w:r>
-        <w:rPr>
-          <w:rFonts w:ascii="Arial" w:eastAsia="Arial" w:hAnsi="Arial" w:cs="Arial"/>
-          <w:color w:val="000000"/>
-        </w:rPr>
-        <w:t>ón exitosa de una reserva actúa como una señal implícita de preferencia positiva fuerte.</w:t>
+        <w:t xml:space="preserve">Integración:</w:t>
+      </w:r>
+      <w:r>
+        <w:rPr>
+          <w:rFonts w:ascii="Arial" w:eastAsia="Arial" w:hAnsi="Arial" w:cs="Arial"/>
+          <w:color w:val="000000"/>
+        </w:rPr>
+        <w:t xml:space="preserve"> el módulo app/ai/gemini_recommendations.py utiliza el SDK oficial google-genai con el modelo gemini-2.5-flash-lite, elegido por su baja latencia y su disponibilidad en el nivel gratuito del servicio.</w:t>
       </w:r>
     </w:p>
     <w:p>
       <w:pPr>
         <w:numPr>
           <w:ilvl w:val="0"/>
-          <w:numId w:val="10"/>
+          <w:numId w:val="2"/>
         </w:numPr>
         <w:spacing w:before="0" w:line="240" w:lineRule="auto"/>
         <w:rPr>
@@ -1863,28 +2433,99 @@
           <w:bCs/>
           <w:color w:val="000000"/>
         </w:rPr>
-        <w:t>Lógica de Actualización:</w:t>
-      </w:r>
-      <w:r>
-        <w:rPr>
-          <w:rFonts w:ascii="Arial" w:eastAsia="Arial" w:hAnsi="Arial" w:cs="Arial"/>
-          <w:color w:val="000000"/>
-        </w:rPr>
-        <w:t xml:space="preserve"> Al momento en que un usuario reserva un destino, sus preferencias internas (vector de características) se ajustan matemáticamente hacia las ca</w:t>
-      </w:r>
-      <w:r>
-        <w:rPr>
-          <w:rFonts w:ascii="Arial" w:eastAsia="Arial" w:hAnsi="Arial" w:cs="Arial"/>
-          <w:color w:val="000000"/>
-        </w:rPr>
-        <w:t>racterísticas de dicho destino, "aprendiendo" de la elección realizada.</w:t>
+        <w:t xml:space="preserve">Flujo de uso:</w:t>
+      </w:r>
+      <w:r>
+        <w:rPr>
+          <w:rFonts w:ascii="Arial" w:eastAsia="Arial" w:hAnsi="Arial" w:cs="Arial"/>
+          <w:color w:val="000000"/>
+        </w:rPr>
+        <w:t xml:space="preserve"> una vez calculada la ruta óptima y seleccionada por el usuario, la interfaz solicita para cada ciudad del recorrido entre tres y cuatro lugares imprescindibles, que se presentan en columnas junto al itinerario.</w:t>
       </w:r>
     </w:p>
     <w:p>
       <w:pPr>
         <w:numPr>
           <w:ilvl w:val="0"/>
-          <w:numId w:val="10"/>
+          <w:numId w:val="2"/>
+        </w:numPr>
+        <w:spacing w:before="0" w:after="240" w:line="240" w:lineRule="auto"/>
+        <w:rPr>
+          <w:color w:val="000000"/>
+        </w:rPr>
+      </w:pPr>
+      <w:r>
+        <w:rPr>
+          <w:rFonts w:ascii="Arial" w:eastAsia="Arial" w:hAnsi="Arial" w:cs="Arial"/>
+          <w:b/>
+          <w:bCs/>
+          <w:color w:val="000000"/>
+        </w:rPr>
+        <w:t xml:space="preserve">Diseño del prompt:</w:t>
+      </w:r>
+      <w:r>
+        <w:rPr>
+          <w:rFonts w:ascii="Arial" w:eastAsia="Arial" w:hAnsi="Arial" w:cs="Arial"/>
+          <w:color w:val="000000"/>
+        </w:rPr>
+        <w:t xml:space="preserve"> la instrucción enviada al modelo fija un rol (asistente de viajes experto), la cantidad de resultados, el formato de salida (lista con viñetas de una o dos líneas) e incluye un ejemplo de respuesta esperada. Además exige responder sin introducción ni cierre, de modo que el texto se inserta directamente en la interfaz sin procesamiento adicional.</w:t>
+      </w:r>
+    </w:p>
+    <w:p>
+      <w:pPr>
+        <w:pStyle w:val="Ttulo3"/>
+        <w:spacing w:before="280" w:after="80"/>
+        <w:jc w:val="left"/>
+        <w:rPr>
+          <w:rFonts w:ascii="Arial" w:eastAsia="Arial" w:hAnsi="Arial" w:cs="Arial"/>
+          <w:color w:val="000000"/>
+          <w:sz w:val="26"/>
+          <w:szCs w:val="26"/>
+        </w:rPr>
+      </w:pPr>
+      <w:r>
+        <w:rPr>
+          <w:rFonts w:ascii="Arial" w:eastAsia="Arial" w:hAnsi="Arial" w:cs="Arial"/>
+          <w:color w:val="000000"/>
+          <w:sz w:val="26"/>
+          <w:szCs w:val="26"/>
+        </w:rPr>
+        <w:t xml:space="preserve">5.2. Decisiones de Eficiencia y Robustez</w:t>
+      </w:r>
+    </w:p>
+    <w:p>
+      <w:pPr>
+        <w:numPr>
+          <w:ilvl w:val="0"/>
+          <w:numId w:val="2"/>
+        </w:numPr>
+        <w:spacing w:before="240" w:line="240" w:lineRule="auto"/>
+        <w:rPr>
+          <w:color w:val="000000"/>
+        </w:rPr>
+      </w:pPr>
+      <w:r>
+        <w:rPr>
+          <w:rFonts w:ascii="Arial" w:eastAsia="Arial" w:hAnsi="Arial" w:cs="Arial"/>
+          <w:b/>
+          <w:bCs/>
+          <w:color w:val="000000"/>
+        </w:rPr>
+        <w:t xml:space="preserve">Memoización de respuestas:</w:t>
+      </w:r>
+      <w:r>
+        <w:rPr>
+          <w:rFonts w:ascii="Arial" w:eastAsia="Arial" w:hAnsi="Arial" w:cs="Arial"/>
+          <w:color w:val="000000"/>
+        </w:rPr>
+        <w:t xml:space="preserve"> Streamlit vuelve a ejecutar el script completo ante cada interacción del usuario. Sin control, cada clic dispararía nuevas llamadas a la API, con su latencia de red y su consumo de cuota. Por eso las recomendaciones se almacenan por ciudad en st.session_state y cada ciudad se consulta una única vez por sesión. Es la misma técnica de memoización aplicada en Held-Karp, trasladada a una operación de red costosa.</w:t>
+      </w:r>
+    </w:p>
+    <w:p>
+      <w:pPr>
+        <w:numPr>
+          <w:ilvl w:val="0"/>
+          <w:numId w:val="2"/>
         </w:numPr>
         <w:spacing w:before="0" w:line="240" w:lineRule="auto"/>
         <w:rPr>
@@ -1898,511 +2539,148 @@
           <w:bCs/>
           <w:color w:val="000000"/>
         </w:rPr>
-        <w:t>Fórmula de Actualización (Promedio Ponderado Exponencial):</w:t>
-      </w:r>
-    </w:p>
-    <w:p>
-      <w:pPr>
-        <w:spacing w:before="0" w:line="240" w:lineRule="auto"/>
-        <w:ind w:left="720"/>
-        <w:jc w:val="center"/>
-        <w:rPr>
-          <w:rFonts w:ascii="Arial" w:eastAsia="Arial" w:hAnsi="Arial" w:cs="Arial"/>
-          <w:color w:val="000000"/>
-        </w:rPr>
-      </w:pPr>
-      <w:r>
-        <w:rPr>
-          <w:rFonts w:ascii="Arial" w:eastAsia="Arial" w:hAnsi="Arial" w:cs="Arial"/>
-          <w:b/>
-          <w:bCs/>
-          <w:color w:val="000000"/>
-        </w:rPr>
-        <w:br/>
-      </w:r>
-      <w:r>
-        <w:rPr>
-          <w:rFonts w:ascii="Arial" w:eastAsia="Arial" w:hAnsi="Arial" w:cs="Arial"/>
-          <w:color w:val="000000"/>
-        </w:rPr>
-        <w:t xml:space="preserve"> </w:t>
-      </w:r>
-      <m:oMath>
-        <m:sSub>
-          <m:sSubPr>
-            <m:ctrlPr>
-              <w:rPr>
-                <w:rFonts w:ascii="Cambria Math" w:eastAsia="Arial" w:hAnsi="Cambria Math" w:cs="Arial"/>
-                <w:b/>
-                <w:i/>
-                <w:color w:val="000000"/>
-                <w:sz w:val="24"/>
-                <w:szCs w:val="24"/>
-                <w:highlight w:val="yellow"/>
-              </w:rPr>
-            </m:ctrlPr>
-          </m:sSubPr>
-          <m:e>
-            <m:r>
-              <w:rPr>
-                <w:rFonts w:ascii="Cambria Math" w:eastAsia="Arial" w:hAnsi="Cambria Math" w:cs="Arial"/>
-                <w:color w:val="000000"/>
-                <w:sz w:val="24"/>
-                <w:szCs w:val="24"/>
-                <w:highlight w:val="yellow"/>
-              </w:rPr>
-              <m:t>P</m:t>
-            </m:r>
-          </m:e>
-          <m:sub>
-            <m:r>
-              <m:rPr>
-                <m:sty m:val="bi"/>
-              </m:rPr>
-              <w:rPr>
-                <w:rFonts w:ascii="Cambria Math" w:eastAsia="Arial" w:hAnsi="Cambria Math" w:cs="Arial"/>
-                <w:color w:val="000000"/>
-                <w:sz w:val="24"/>
-                <w:szCs w:val="24"/>
-                <w:highlight w:val="yellow"/>
-              </w:rPr>
-              <m:t>nueva</m:t>
-            </m:r>
-          </m:sub>
-        </m:sSub>
-        <m:r>
-          <w:rPr>
-            <w:rFonts w:ascii="Cambria Math" w:eastAsia="Arial" w:hAnsi="Cambria Math" w:cs="Arial"/>
-            <w:color w:val="000000"/>
-            <w:sz w:val="24"/>
-            <w:szCs w:val="24"/>
-            <w:highlight w:val="yellow"/>
-          </w:rPr>
-          <m:t xml:space="preserve"> = (</m:t>
-        </m:r>
-        <m:sSub>
-          <m:sSubPr>
-            <m:ctrlPr>
-              <w:rPr>
-                <w:rFonts w:ascii="Cambria Math" w:eastAsia="Arial" w:hAnsi="Cambria Math" w:cs="Arial"/>
-                <w:i/>
-                <w:color w:val="000000"/>
-                <w:sz w:val="24"/>
-                <w:szCs w:val="24"/>
-                <w:highlight w:val="yellow"/>
-              </w:rPr>
-            </m:ctrlPr>
-          </m:sSubPr>
-          <m:e>
-            <m:r>
-              <w:rPr>
-                <w:rFonts w:ascii="Cambria Math" w:eastAsia="Arial" w:hAnsi="Cambria Math" w:cs="Arial"/>
-                <w:color w:val="000000"/>
-                <w:sz w:val="24"/>
-                <w:szCs w:val="24"/>
-                <w:highlight w:val="yellow"/>
-              </w:rPr>
-              <m:t>P</m:t>
-            </m:r>
-          </m:e>
-          <m:sub>
-            <m:r>
-              <w:rPr>
-                <w:rFonts w:ascii="Cambria Math" w:eastAsia="Arial" w:hAnsi="Cambria Math" w:cs="Arial"/>
-                <w:color w:val="000000"/>
-                <w:sz w:val="24"/>
-                <w:szCs w:val="24"/>
-                <w:highlight w:val="yellow"/>
-              </w:rPr>
-              <m:t>actual</m:t>
-            </m:r>
-          </m:sub>
-        </m:sSub>
-        <m:r>
-          <w:rPr>
-            <w:rFonts w:ascii="Cambria Math" w:eastAsia="Arial" w:hAnsi="Cambria Math" w:cs="Arial"/>
-            <w:color w:val="000000"/>
-            <w:sz w:val="24"/>
-            <w:szCs w:val="24"/>
-            <w:highlight w:val="yellow"/>
-          </w:rPr>
-          <m:t xml:space="preserve"> × (1 - α)) + (</m:t>
-        </m:r>
-        <m:sSub>
-          <m:sSubPr>
-            <m:ctrlPr>
-              <w:rPr>
-                <w:rFonts w:ascii="Cambria Math" w:eastAsia="Arial" w:hAnsi="Cambria Math" w:cs="Arial"/>
-                <w:i/>
-                <w:color w:val="000000"/>
-                <w:sz w:val="24"/>
-                <w:szCs w:val="24"/>
-                <w:highlight w:val="yellow"/>
-              </w:rPr>
-            </m:ctrlPr>
-          </m:sSubPr>
-          <m:e>
-            <m:r>
-              <w:rPr>
-                <w:rFonts w:ascii="Cambria Math" w:eastAsia="Arial" w:hAnsi="Cambria Math" w:cs="Arial"/>
-                <w:color w:val="000000"/>
-                <w:sz w:val="24"/>
-                <w:szCs w:val="24"/>
-                <w:highlight w:val="yellow"/>
-              </w:rPr>
-              <m:t>C</m:t>
-            </m:r>
-          </m:e>
-          <m:sub>
-            <m:r>
-              <w:rPr>
-                <w:rFonts w:ascii="Cambria Math" w:eastAsia="Arial" w:hAnsi="Cambria Math" w:cs="Arial"/>
-                <w:color w:val="000000"/>
-                <w:sz w:val="24"/>
-                <w:szCs w:val="24"/>
-                <w:highlight w:val="yellow"/>
-              </w:rPr>
-              <m:t>destino</m:t>
-            </m:r>
-          </m:sub>
-        </m:sSub>
-        <m:r>
-          <w:rPr>
-            <w:rFonts w:ascii="Cambria Math" w:eastAsia="Arial" w:hAnsi="Cambria Math" w:cs="Arial"/>
-            <w:color w:val="000000"/>
-            <w:sz w:val="24"/>
-            <w:szCs w:val="24"/>
-            <w:highlight w:val="yellow"/>
-          </w:rPr>
-          <m:t xml:space="preserve"> ×α)</m:t>
-        </m:r>
-        <m:r>
-          <w:rPr>
-            <w:rFonts w:ascii="Cambria Math" w:eastAsia="Arial" w:hAnsi="Cambria Math" w:cs="Arial"/>
-            <w:color w:val="000000"/>
-            <w:sz w:val="24"/>
-            <w:szCs w:val="24"/>
-          </w:rPr>
-          <w:br/>
-        </m:r>
-      </m:oMath>
-    </w:p>
-    <w:p>
-      <w:pPr>
-        <w:spacing w:before="0" w:line="240" w:lineRule="auto"/>
-        <w:ind w:left="720"/>
-        <w:rPr>
-          <w:color w:val="000000"/>
-        </w:rPr>
-      </w:pPr>
-      <w:r>
-        <w:rPr>
-          <w:rFonts w:ascii="Arial" w:eastAsia="Arial" w:hAnsi="Arial" w:cs="Arial"/>
-          <w:color w:val="000000"/>
-        </w:rPr>
-        <w:t xml:space="preserve"> Donde:</w:t>
+        <w:t xml:space="preserve">Cliente único con inicialización diferida:</w:t>
+      </w:r>
+      <w:r>
+        <w:rPr>
+          <w:rFonts w:ascii="Arial" w:eastAsia="Arial" w:hAnsi="Arial" w:cs="Arial"/>
+          <w:color w:val="000000"/>
+        </w:rPr>
+        <w:t xml:space="preserve"> el cliente de Gemini se crea en la primera solicitud y se reutiliza en las siguientes, evitando repetir la inicialización y la autenticación.</w:t>
       </w:r>
     </w:p>
     <w:p>
       <w:pPr>
         <w:numPr>
-          <w:ilvl w:val="1"/>
-          <w:numId w:val="10"/>
+          <w:ilvl w:val="0"/>
+          <w:numId w:val="2"/>
         </w:numPr>
         <w:spacing w:before="0" w:line="240" w:lineRule="auto"/>
         <w:rPr>
-          <w:rFonts w:ascii="Arial" w:eastAsia="Arial" w:hAnsi="Arial" w:cs="Arial"/>
-          <w:color w:val="000000"/>
-        </w:rPr>
-      </w:pPr>
-      <m:oMath>
-        <m:sSub>
-          <m:sSubPr>
-            <m:ctrlPr>
-              <w:rPr>
-                <w:rFonts w:ascii="Cambria Math" w:eastAsia="Arial" w:hAnsi="Cambria Math" w:cs="Arial"/>
-                <w:b/>
-                <w:i/>
-                <w:color w:val="000000"/>
-                <w:sz w:val="24"/>
-                <w:szCs w:val="24"/>
-                <w:highlight w:val="yellow"/>
-              </w:rPr>
-            </m:ctrlPr>
-          </m:sSubPr>
-          <m:e>
-            <m:r>
-              <w:rPr>
-                <w:rFonts w:ascii="Cambria Math" w:eastAsia="Arial" w:hAnsi="Cambria Math" w:cs="Arial"/>
-                <w:color w:val="000000"/>
-                <w:sz w:val="24"/>
-                <w:szCs w:val="24"/>
-                <w:highlight w:val="yellow"/>
-              </w:rPr>
-              <m:t>P</m:t>
-            </m:r>
-          </m:e>
-          <m:sub>
-            <m:r>
-              <m:rPr>
-                <m:sty m:val="bi"/>
-              </m:rPr>
-              <w:rPr>
-                <w:rFonts w:ascii="Cambria Math" w:eastAsia="Arial" w:hAnsi="Cambria Math" w:cs="Arial"/>
-                <w:color w:val="000000"/>
-                <w:sz w:val="24"/>
-                <w:szCs w:val="24"/>
-                <w:highlight w:val="yellow"/>
-              </w:rPr>
-              <m:t>nueva</m:t>
-            </m:r>
-          </m:sub>
-        </m:sSub>
-      </m:oMath>
-      <w:r>
-        <w:rPr>
-          <w:rFonts w:ascii="Arial" w:eastAsia="Arial" w:hAnsi="Arial" w:cs="Arial"/>
-          <w:color w:val="000000"/>
-          <w:highlight w:val="yellow"/>
-        </w:rPr>
-        <w:t>:</w:t>
-      </w:r>
-      <w:r>
-        <w:rPr>
-          <w:rFonts w:ascii="Arial" w:eastAsia="Arial" w:hAnsi="Arial" w:cs="Arial"/>
-          <w:color w:val="000000"/>
-        </w:rPr>
-        <w:t xml:space="preserve"> Nuevo valor de preferencia</w:t>
-      </w:r>
-      <w:r>
-        <w:rPr>
-          <w:rFonts w:ascii="Arial" w:eastAsia="Arial" w:hAnsi="Arial" w:cs="Arial"/>
-          <w:color w:val="000000"/>
-        </w:rPr>
-        <w:t xml:space="preserve"> después del paso de aprendizaje.</w:t>
+          <w:color w:val="000000"/>
+        </w:rPr>
+      </w:pPr>
+      <w:r>
+        <w:rPr>
+          <w:rFonts w:ascii="Arial" w:eastAsia="Arial" w:hAnsi="Arial" w:cs="Arial"/>
+          <w:b/>
+          <w:bCs/>
+          <w:color w:val="000000"/>
+        </w:rPr>
+        <w:t xml:space="preserve">Degradación controlada:</w:t>
+      </w:r>
+      <w:r>
+        <w:rPr>
+          <w:rFonts w:ascii="Arial" w:eastAsia="Arial" w:hAnsi="Arial" w:cs="Arial"/>
+          <w:color w:val="000000"/>
+        </w:rPr>
+        <w:t xml:space="preserve"> si la librería no está instalada, la clave no está configurada o la API responde con error, las funciones devuelven un valor nulo y la interfaz muestra un aviso. El cálculo de rutas y las reservas continúan funcionando con normalidad: la IA es un complemento y nunca un punto único de falla.</w:t>
       </w:r>
     </w:p>
     <w:p>
       <w:pPr>
         <w:numPr>
-          <w:ilvl w:val="1"/>
-          <w:numId w:val="10"/>
-        </w:numPr>
-        <w:spacing w:before="0" w:line="240" w:lineRule="auto"/>
-        <w:rPr>
-          <w:rFonts w:ascii="Arial" w:eastAsia="Arial" w:hAnsi="Arial" w:cs="Arial"/>
-          <w:color w:val="000000"/>
-        </w:rPr>
-      </w:pPr>
-      <m:oMath>
-        <m:sSub>
-          <m:sSubPr>
-            <m:ctrlPr>
-              <w:rPr>
-                <w:rFonts w:ascii="Cambria Math" w:eastAsia="Arial" w:hAnsi="Cambria Math" w:cs="Arial"/>
-                <w:i/>
-                <w:color w:val="000000"/>
-                <w:sz w:val="24"/>
-                <w:highlight w:val="yellow"/>
-              </w:rPr>
-            </m:ctrlPr>
-          </m:sSubPr>
-          <m:e>
-            <m:r>
-              <w:rPr>
-                <w:rFonts w:ascii="Cambria Math" w:eastAsia="Arial" w:hAnsi="Cambria Math" w:cs="Arial"/>
-                <w:color w:val="000000"/>
-                <w:sz w:val="24"/>
-                <w:highlight w:val="yellow"/>
-              </w:rPr>
-              <m:t>P</m:t>
-            </m:r>
-          </m:e>
-          <m:sub>
-            <m:r>
-              <w:rPr>
-                <w:rFonts w:ascii="Cambria Math" w:eastAsia="Arial" w:hAnsi="Cambria Math" w:cs="Arial"/>
-                <w:color w:val="000000"/>
-                <w:sz w:val="24"/>
-                <w:highlight w:val="yellow"/>
-              </w:rPr>
-              <m:t>actual</m:t>
-            </m:r>
-          </m:sub>
-        </m:sSub>
-      </m:oMath>
-      <w:r>
-        <w:rPr>
-          <w:rFonts w:ascii="Arial" w:eastAsia="Arial" w:hAnsi="Arial" w:cs="Arial"/>
-          <w:color w:val="000000"/>
-        </w:rPr>
-        <w:t>: Valor de preferencia antes de la reserva.</w:t>
-      </w:r>
-    </w:p>
-    <w:p>
-      <w:pPr>
-        <w:numPr>
-          <w:ilvl w:val="1"/>
-          <w:numId w:val="10"/>
-        </w:numPr>
-        <w:spacing w:before="0" w:line="240" w:lineRule="auto"/>
-        <w:rPr>
-          <w:rFonts w:ascii="Arial" w:eastAsia="Arial" w:hAnsi="Arial" w:cs="Arial"/>
-          <w:color w:val="000000"/>
-        </w:rPr>
-      </w:pPr>
-      <m:oMath>
-        <m:sSub>
-          <m:sSubPr>
-            <m:ctrlPr>
-              <w:rPr>
-                <w:rFonts w:ascii="Cambria Math" w:eastAsia="Arial" w:hAnsi="Cambria Math" w:cs="Arial"/>
-                <w:i/>
-                <w:color w:val="000000"/>
-                <w:sz w:val="24"/>
-                <w:highlight w:val="yellow"/>
-              </w:rPr>
-            </m:ctrlPr>
-          </m:sSubPr>
-          <m:e>
-            <m:r>
-              <w:rPr>
-                <w:rFonts w:ascii="Cambria Math" w:eastAsia="Arial" w:hAnsi="Cambria Math" w:cs="Arial"/>
-                <w:color w:val="000000"/>
-                <w:sz w:val="24"/>
-                <w:highlight w:val="yellow"/>
-              </w:rPr>
-              <m:t>C</m:t>
-            </m:r>
-          </m:e>
-          <m:sub>
-            <m:r>
-              <w:rPr>
-                <w:rFonts w:ascii="Cambria Math" w:eastAsia="Arial" w:hAnsi="Cambria Math" w:cs="Arial"/>
-                <w:color w:val="000000"/>
-                <w:sz w:val="24"/>
-                <w:highlight w:val="yellow"/>
-              </w:rPr>
-              <m:t>destino</m:t>
-            </m:r>
-          </m:sub>
-        </m:sSub>
-      </m:oMath>
-      <w:r>
-        <w:rPr>
-          <w:rFonts w:ascii="Arial" w:eastAsia="Arial" w:hAnsi="Arial" w:cs="Arial"/>
-          <w:color w:val="000000"/>
-          <w:highlight w:val="yellow"/>
-        </w:rPr>
-        <w:t>:</w:t>
-      </w:r>
-      <w:r>
-        <w:rPr>
-          <w:rFonts w:ascii="Arial" w:eastAsia="Arial" w:hAnsi="Arial" w:cs="Arial"/>
-          <w:color w:val="000000"/>
-        </w:rPr>
-        <w:t xml:space="preserve"> Valor de la característica en el destino reservado (la nueva evidencia).</w:t>
-      </w:r>
-    </w:p>
-    <w:p>
-      <w:pPr>
-        <w:numPr>
-          <w:ilvl w:val="1"/>
-          <w:numId w:val="10"/>
+          <w:ilvl w:val="0"/>
+          <w:numId w:val="2"/>
         </w:numPr>
         <w:spacing w:before="0" w:after="240" w:line="240" w:lineRule="auto"/>
         <w:rPr>
           <w:color w:val="000000"/>
         </w:rPr>
       </w:pPr>
-      <m:oMath>
-        <m:r>
-          <w:rPr>
-            <w:rFonts w:ascii="Cambria Math" w:eastAsia="Arial" w:hAnsi="Cambria Math" w:cs="Arial"/>
-            <w:color w:val="000000"/>
-            <w:sz w:val="24"/>
-            <w:highlight w:val="yellow"/>
-          </w:rPr>
-          <m:t>α</m:t>
-        </m:r>
-      </m:oMath>
-      <w:r>
-        <w:rPr>
-          <w:rFonts w:ascii="Arial" w:eastAsia="Arial" w:hAnsi="Arial" w:cs="Arial"/>
-          <w:color w:val="000000"/>
-          <w:highlight w:val="yellow"/>
-        </w:rPr>
-        <w:t xml:space="preserve"> (Alpha):</w:t>
-      </w:r>
-      <w:r>
-        <w:rPr>
-          <w:rFonts w:ascii="Arial" w:eastAsia="Arial" w:hAnsi="Arial" w:cs="Arial"/>
-          <w:color w:val="000000"/>
-        </w:rPr>
-        <w:t xml:space="preserve"> Tasa de aprendizaje, fijada empíricamente en 0.1.</w:t>
-      </w:r>
-    </w:p>
-    <w:p>
-      <w:pPr>
-        <w:spacing w:before="240" w:after="240" w:line="240" w:lineRule="auto"/>
-        <w:rPr>
-          <w:rFonts w:ascii="Arial" w:eastAsia="Arial" w:hAnsi="Arial" w:cs="Arial"/>
-          <w:color w:val="000000"/>
-        </w:rPr>
-      </w:pPr>
-      <w:r>
-        <w:rPr>
-          <w:rFonts w:ascii="Arial" w:eastAsia="Arial" w:hAnsi="Arial" w:cs="Arial"/>
-          <w:color w:val="000000"/>
-        </w:rPr>
-        <w:t>Esta fórmu</w:t>
-      </w:r>
-      <w:r>
-        <w:rPr>
-          <w:rFonts w:ascii="Arial" w:eastAsia="Arial" w:hAnsi="Arial" w:cs="Arial"/>
-          <w:color w:val="000000"/>
-        </w:rPr>
-        <w:t xml:space="preserve">la se basa en el concepto de </w:t>
-      </w:r>
-      <w:r>
-        <w:rPr>
-          <w:rFonts w:ascii="Arial" w:eastAsia="Arial" w:hAnsi="Arial" w:cs="Arial"/>
-          <w:b/>
-          <w:bCs/>
-          <w:color w:val="000000"/>
-        </w:rPr>
-        <w:t>Promedio Ponderado Exponencial</w:t>
-      </w:r>
-      <w:r>
-        <w:rPr>
-          <w:rFonts w:ascii="Arial" w:eastAsia="Arial" w:hAnsi="Arial" w:cs="Arial"/>
-          <w:color w:val="000000"/>
-        </w:rPr>
-        <w:t xml:space="preserve"> (EWMA), ampliamente utilizado en sistemas de control adaptativo y algoritmos de aprendizaje por refuerzo para actualizar estimaciones de valor. Permite al sistema capturar cambios en las preferenc</w:t>
-      </w:r>
-      <w:r>
-        <w:rPr>
-          <w:rFonts w:ascii="Arial" w:eastAsia="Arial" w:hAnsi="Arial" w:cs="Arial"/>
-          <w:color w:val="000000"/>
-        </w:rPr>
-        <w:t xml:space="preserve">ias del usuario de manera gradual (gracias a un </w:t>
-      </w:r>
-      <m:oMath>
-        <m:r>
-          <w:rPr>
-            <w:rFonts w:ascii="Cambria Math" w:eastAsia="Arial" w:hAnsi="Cambria Math" w:cs="Arial"/>
-            <w:color w:val="000000"/>
-            <w:sz w:val="24"/>
-          </w:rPr>
-          <m:t>α</m:t>
-        </m:r>
-      </m:oMath>
-      <w:r>
-        <w:rPr>
-          <w:rFonts w:ascii="Arial" w:eastAsia="Arial" w:hAnsi="Arial" w:cs="Arial"/>
-          <w:color w:val="000000"/>
-        </w:rPr>
-        <w:t xml:space="preserve"> pequeño para estabilidad) y automática, manteniendo la robustez ante datos atípicos y operando con una eficiencia computacional O(1).</w:t>
+      <w:r>
+        <w:rPr>
+          <w:rFonts w:ascii="Arial" w:eastAsia="Arial" w:hAnsi="Arial" w:cs="Arial"/>
+          <w:b/>
+          <w:bCs/>
+          <w:color w:val="000000"/>
+        </w:rPr>
+        <w:t xml:space="preserve">Gestión segura de la credencial:</w:t>
+      </w:r>
+      <w:r>
+        <w:rPr>
+          <w:rFonts w:ascii="Arial" w:eastAsia="Arial" w:hAnsi="Arial" w:cs="Arial"/>
+          <w:color w:val="000000"/>
+        </w:rPr>
+        <w:t xml:space="preserve"> la clave de acceso se lee de la variable de entorno GOOGLE_API_KEY y no se almacena en el código fuente.</w:t>
+      </w:r>
+    </w:p>
+    <w:p>
+      <w:pPr>
+        <w:pStyle w:val="Ttulo3"/>
+        <w:spacing w:before="280" w:after="80"/>
+        <w:jc w:val="left"/>
+        <w:rPr>
+          <w:rFonts w:ascii="Arial" w:eastAsia="Arial" w:hAnsi="Arial" w:cs="Arial"/>
+          <w:color w:val="000000"/>
+          <w:sz w:val="26"/>
+          <w:szCs w:val="26"/>
+        </w:rPr>
+      </w:pPr>
+      <w:r>
+        <w:rPr>
+          <w:rFonts w:ascii="Arial" w:eastAsia="Arial" w:hAnsi="Arial" w:cs="Arial"/>
+          <w:color w:val="000000"/>
+          <w:sz w:val="26"/>
+          <w:szCs w:val="26"/>
+        </w:rPr>
+        <w:t xml:space="preserve">5.3. Alcance y Limitaciones</w:t>
+      </w:r>
+    </w:p>
+    <w:p>
+      <w:pPr>
+        <w:numPr>
+          <w:ilvl w:val="0"/>
+          <w:numId w:val="2"/>
+        </w:numPr>
+        <w:spacing w:before="240" w:line="240" w:lineRule="auto"/>
+        <w:rPr>
+          <w:color w:val="000000"/>
+        </w:rPr>
+      </w:pPr>
+      <w:r>
+        <w:rPr>
+          <w:rFonts w:ascii="Arial" w:eastAsia="Arial" w:hAnsi="Arial" w:cs="Arial"/>
+          <w:b/>
+          <w:bCs/>
+          <w:color w:val="000000"/>
+        </w:rPr>
+        <w:t xml:space="preserve">Recomendación contextual, no aprendida:</w:t>
+      </w:r>
+      <w:r>
+        <w:rPr>
+          <w:rFonts w:ascii="Arial" w:eastAsia="Arial" w:hAnsi="Arial" w:cs="Arial"/>
+          <w:color w:val="000000"/>
+        </w:rPr>
+        <w:t xml:space="preserve"> las sugerencias dependen únicamente de la ciudad consultada. El enunciado plantea recomendaciones según preferencias aprendidas; la implementación actual cubre la recomendación por destino, y la personalización a partir del historial de reservas del usuario queda como línea de trabajo futuro.</w:t>
+      </w:r>
+    </w:p>
+    <w:p>
+      <w:pPr>
+        <w:numPr>
+          <w:ilvl w:val="0"/>
+          <w:numId w:val="2"/>
+        </w:numPr>
+        <w:spacing w:before="0" w:after="240" w:line="240" w:lineRule="auto"/>
+        <w:rPr>
+          <w:color w:val="000000"/>
+        </w:rPr>
+      </w:pPr>
+      <w:r>
+        <w:rPr>
+          <w:rFonts w:ascii="Arial" w:eastAsia="Arial" w:hAnsi="Arial" w:cs="Arial"/>
+          <w:b/>
+          <w:bCs/>
+          <w:color w:val="000000"/>
+        </w:rPr>
+        <w:t xml:space="preserve">Contenido generativo:</w:t>
+      </w:r>
+      <w:r>
+        <w:rPr>
+          <w:rFonts w:ascii="Arial" w:eastAsia="Arial" w:hAnsi="Arial" w:cs="Arial"/>
+          <w:color w:val="000000"/>
+        </w:rPr>
+        <w:t xml:space="preserve"> como toda salida de un modelo de lenguaje, el texto no se verifica contra una fuente externa y se presenta al usuario como sugerencia.</w:t>
       </w:r>
     </w:p>
     <w:p>

</xml_diff>

<commit_message>
docs: align report, slides and README with the final architecture
</commit_message>
<xml_diff>
--- a/Informe Final PEF.docx
+++ b/Informe Final PEF.docx
@@ -375,30 +375,23 @@
           <w:rFonts w:ascii="Arial" w:eastAsia="Arial" w:hAnsi="Arial" w:cs="Arial"/>
           <w:color w:val="000000"/>
         </w:rPr>
-        <w:t xml:space="preserve">La construcción del sistema sigue rigurosamente un patrón de arquitectura </w:t>
-      </w:r>
-      <w:r>
-        <w:rPr>
-          <w:rFonts w:ascii="Arial" w:eastAsia="Arial" w:hAnsi="Arial" w:cs="Arial"/>
-          <w:b/>
-          <w:bCs/>
-          <w:color w:val="000000"/>
-        </w:rPr>
-        <w:t>hexagonal simplificada (Puertos y Adaptadores)</w:t>
-      </w:r>
-      <w:r>
-        <w:rPr>
-          <w:rFonts w:ascii="Arial" w:eastAsia="Arial" w:hAnsi="Arial" w:cs="Arial"/>
-          <w:color w:val="000000"/>
-        </w:rPr>
-        <w:t xml:space="preserve">. Esta decisión arquitectónica permite desacoplar completamente la lógica de negocio central (core) de las interfaces externas y mecanismos de entrega (api, ui, bases de datos), garantizando que el núcleo del sistema permanezca agnóstico a los detalles de </w:t>
-      </w:r>
-      <w:r>
-        <w:rPr>
-          <w:rFonts w:ascii="Arial" w:eastAsia="Arial" w:hAnsi="Arial" w:cs="Arial"/>
-          <w:color w:val="000000"/>
-        </w:rPr>
-        <w:t>implementación de la infraestructura.</w:t>
+        <w:t xml:space="preserve">El sistema sigue una </w:t>
+      </w:r>
+      <w:r>
+        <w:rPr>
+          <w:rFonts w:ascii="Arial" w:eastAsia="Arial" w:hAnsi="Arial" w:cs="Arial"/>
+          <w:b/>
+          <w:bCs/>
+          <w:color w:val="000000"/>
+        </w:rPr>
+        <w:t xml:space="preserve">arquitectura en capas de tipo cliente–servidor</w:t>
+      </w:r>
+      <w:r>
+        <w:rPr>
+          <w:rFonts w:ascii="Arial" w:eastAsia="Arial" w:hAnsi="Arial" w:cs="Arial"/>
+          <w:color w:val="000000"/>
+        </w:rPr>
+        <w:t xml:space="preserve">. La interfaz web (Streamlit) actúa como un cliente liviano que se comunica por HTTP con una API REST (FastAPI); la API valida las solicitudes, decide qué algoritmo aplicar, gestiona la caché, las reservas y las métricas, y delega el cálculo en el núcleo algorítmico (app.core), que no depende de FastAPI ni de Streamlit. El flujo principal es: Streamlit (app.ui) → API FastAPI (app/api/server.py) → algoritmos (Dijkstra, Held-Karp y genético), con los módulos de soporte caches, booking (reservas por lotes), ai (recomendaciones con Gemini) y data (ciudades y rutas). No se trata de una arquitectura hexagonal formal: no se definieron puertos ni adaptadores explícitos, sino una separación por capas y responsabilidades.</w:t>
       </w:r>
     </w:p>
     <w:p>
@@ -729,39 +722,23 @@
           <w:rFonts w:ascii="Arial" w:eastAsia="Arial" w:hAnsi="Arial" w:cs="Arial"/>
           <w:color w:val="000000"/>
         </w:rPr>
-        <w:t xml:space="preserve">app.ui (Capa de Presentación): Desarrollada utilizando </w:t>
-      </w:r>
-      <w:r>
-        <w:rPr>
-          <w:rFonts w:ascii="Arial" w:eastAsia="Arial" w:hAnsi="Arial" w:cs="Arial"/>
-          <w:b/>
-          <w:bCs/>
-          <w:color w:val="000000"/>
-        </w:rPr>
-        <w:t>Streamlit</w:t>
-      </w:r>
-      <w:r>
-        <w:rPr>
-          <w:rFonts w:ascii="Arial" w:eastAsia="Arial" w:hAnsi="Arial" w:cs="Arial"/>
-          <w:color w:val="000000"/>
-        </w:rPr>
-        <w:t xml:space="preserve">, esta capa consume la API del </w:t>
-      </w:r>
-      <w:r>
-        <w:rPr>
-          <w:rFonts w:ascii="Arial" w:eastAsia="Arial" w:hAnsi="Arial" w:cs="Arial"/>
-          <w:i/>
-          <w:iCs/>
-          <w:color w:val="000000"/>
-        </w:rPr>
-        <w:t>backend</w:t>
-      </w:r>
-      <w:r>
-        <w:rPr>
-          <w:rFonts w:ascii="Arial" w:eastAsia="Arial" w:hAnsi="Arial" w:cs="Arial"/>
-          <w:color w:val="000000"/>
-        </w:rPr>
-        <w:t xml:space="preserve"> de manera agnóstica para proporcionar una experiencia visual interactiva, intuitiva y responsiva al usuario final, permitiendo la visualización de datos complejos y la interacción fluida con el sistema.</w:t>
+        <w:t xml:space="preserve">app.ui (Capa de Presentación): </w:t>
+      </w:r>
+      <w:r>
+        <w:rPr>
+          <w:rFonts w:ascii="Arial" w:eastAsia="Arial" w:hAnsi="Arial" w:cs="Arial"/>
+          <w:b/>
+          <w:bCs/>
+          <w:color w:val="000000"/>
+        </w:rPr>
+        <w:t xml:space="preserve">Streamlit</w:t>
+      </w:r>
+      <w:r>
+        <w:rPr>
+          <w:rFonts w:ascii="Arial" w:eastAsia="Arial" w:hAnsi="Arial" w:cs="Arial"/>
+          <w:color w:val="000000"/>
+        </w:rPr>
+        <w:t xml:space="preserve">, organizada en módulos auxiliares (cliente HTTP api_client.py, estado, estilos, formato y mapas) y una vista por página en app/ui/views/. Es un cliente liviano: el cálculo de rutas, las comparaciones, las reservas y las estadísticas se solicitan a la API por HTTP, y la interfaz no elige el algoritmo. Como excepciones deliberadas, lee los datos estáticos de ciudades y rutas, consulta directamente a Gemini para las recomendaciones y ejecuta en su propio proceso el benchmark controlado del Laboratorio.</w:t>
       </w:r>
     </w:p>
     <w:p>
@@ -1422,7 +1399,7 @@
           <w:rFonts w:ascii="Arial" w:eastAsia="Arial" w:hAnsi="Arial" w:cs="Arial"/>
           <w:color w:val="000000"/>
         </w:rPr>
-        <w:t xml:space="preserve">En consecuencia, el sistema emplea tres algoritmos, seleccionados según la cantidad de ciudades del itinerario:</w:t>
+        <w:t xml:space="preserve">En consecuencia, el sistema emplea tres algoritmos, seleccionados según la cantidad de ciudades del itinerario. La selección la realiza el servidor, no la interfaz: el endpoint /routes/optimize-multi aplica Held-Karp hasta HELD_KARP_MAX (12) ciudades y el algoritmo genético por encima de ese umbral, con un máximo de MAX_TSP_CITIES (25); un pedido mayor se rechaza con código 422. Los itinerarios de dos ciudades se resuelven con /routes/shortest (Dijkstra).</w:t>
       </w:r>
     </w:p>
     <w:tbl>
@@ -1654,7 +1631,7 @@
                 <w:sz w:val="20"/>
                 <w:szCs w:val="20"/>
               </w:rPr>
-              <w:t xml:space="preserve">13 o más</w:t>
+              <w:t xml:space="preserve">13 a 25</w:t>
             </w:r>
           </w:p>
         </w:tc>
@@ -1711,7 +1688,7 @@
           <w:rFonts w:ascii="Arial" w:eastAsia="Arial" w:hAnsi="Arial" w:cs="Arial"/>
           <w:color w:val="000000"/>
         </w:rPr>
-        <w:t xml:space="preserve">En síntesis: Dijkstra determina cómo desplazarse de una ciudad a otra, mientras que el TSP determina en qué orden recorrer todas. El algoritmo genético se incorpora porque, a partir de cierto tamaño, calcular el orden exacto deja de ser factible en un tiempo razonable.</w:t>
+        <w:t xml:space="preserve">En síntesis: Dijkstra determina cómo desplazarse de una ciudad a otra, mientras que el TSP determina en qué orden recorrer todas. El algoritmo genético se incorpora porque, a partir de cierto tamaño, calcular el orden exacto deja de ser factible en un tiempo razonable. La solicitud admite además un campo opcional algorithm para forzar uno u otro método (Held-Karp se rechaza por encima de 12 ciudades), y la respuesta informa el algoritmo utilizado (algorithm), la ruta (optimal_route), el costo total (total_cost), el tiempo medido en el servidor (elapsed_ms), la evolución del genético (history) y si el resultado provino de la caché (cached).</w:t>
       </w:r>
     </w:p>
     <w:p>
@@ -2511,14 +2488,14 @@
           <w:bCs/>
           <w:color w:val="000000"/>
         </w:rPr>
-        <w:t xml:space="preserve">Memoización de respuestas:</w:t>
-      </w:r>
-      <w:r>
-        <w:rPr>
-          <w:rFonts w:ascii="Arial" w:eastAsia="Arial" w:hAnsi="Arial" w:cs="Arial"/>
-          <w:color w:val="000000"/>
-        </w:rPr>
-        <w:t xml:space="preserve"> Streamlit vuelve a ejecutar el script completo ante cada interacción del usuario. Sin control, cada clic dispararía nuevas llamadas a la API, con su latencia de red y su consumo de cuota. Por eso las recomendaciones se almacenan por ciudad en st.session_state y cada ciudad se consulta una única vez por sesión. Es la misma técnica de memoización aplicada en Held-Karp, trasladada a una operación de red costosa.</w:t>
+        <w:t xml:space="preserve">Memoización y consultas en paralelo:</w:t>
+      </w:r>
+      <w:r>
+        <w:rPr>
+          <w:rFonts w:ascii="Arial" w:eastAsia="Arial" w:hAnsi="Arial" w:cs="Arial"/>
+          <w:color w:val="000000"/>
+        </w:rPr>
+        <w:t xml:space="preserve"> Streamlit vuelve a ejecutar el script completo ante cada interacción del usuario. Sin control, cada clic dispararía nuevas llamadas a la API, con su latencia de red y su consumo de cuota. Por eso las recomendaciones obtenidas con éxito se guardan en una caché compartida del proceso (RecommendationCache) y en st.session_state, y solo se consultan las ciudades que faltan. Esas consultas se realizan en paralelo (ThreadPoolExecutor, hasta ocho simultáneas), de modo que la espera se aproxima a la de la ciudad más lenta y no a la suma de todas. Las respuestas fallidas no se almacenan, por lo que pueden reintentarse. Es la misma técnica de memoización aplicada en Held-Karp, trasladada a una operación de red costosa.</w:t>
       </w:r>
     </w:p>
     <w:p>
@@ -3359,21 +3336,14 @@
           <w:bCs/>
           <w:color w:val="000000"/>
         </w:rPr>
-        <w:t>La Solución:</w:t>
-      </w:r>
-      <w:r>
-        <w:rPr>
-          <w:rFonts w:ascii="Arial" w:eastAsia="Arial" w:hAnsi="Arial" w:cs="Arial"/>
-          <w:color w:val="000000"/>
-        </w:rPr>
-        <w:t xml:space="preserve"> Se refactorizó el método a una versión no bloqueante add_item_sync. Actualmente, la solicitud se añade a la cola y retorna inmediatamente un objeto "Futuro" (promesa) al cliente, mientras una tarea de fondo independiente (_trigger_processing) gestiona el </w:t>
-      </w:r>
-      <w:r>
-        <w:rPr>
-          <w:rFonts w:ascii="Arial" w:eastAsia="Arial" w:hAnsi="Arial" w:cs="Arial"/>
-          <w:color w:val="000000"/>
-        </w:rPr>
-        <w:t>vaciado y procesamiento de la cola de manera asíncrona, eliminando el cuello de botella.</w:t>
+        <w:t xml:space="preserve">La Solución:</w:t>
+      </w:r>
+      <w:r>
+        <w:rPr>
+          <w:rFonts w:ascii="Arial" w:eastAsia="Arial" w:hAnsi="Arial" w:cs="Arial"/>
+          <w:color w:val="000000"/>
+        </w:rPr>
+        <w:t xml:space="preserve"> Se refactorizó el método a una versión no bloqueante add_item_sync. Actualmente, la solicitud se añade a la cola y retorna inmediatamente un objeto "Futuro" (promesa) al cliente, mientras una tarea de fondo (trigger_processing) gestiona el vaciado y procesamiento de la cola de manera asíncrona. Además, cada reserva encolada lanza un intento de procesamiento, el servidor revisa la cola cada 0,5 segundos y el tiempo máximo de espera del lote es también de 0,5 segundos, por lo que las reservas se confirman casi de inmediato; la interfaz actualiza automáticamente los estados pendientes.</w:t>
       </w:r>
     </w:p>
     <w:p>
@@ -3636,6 +3606,34 @@
           <w:color w:val="000000"/>
         </w:rPr>
         <w:t>mitaciones teóricas del problema NP-Hard.</w:t>
+      </w:r>
+    </w:p>
+    <w:p>
+      <w:pPr>
+        <w:numPr>
+          <w:ilvl w:val="0"/>
+          <w:numId w:val="9"/>
+        </w:numPr>
+        <w:spacing w:before="0" w:after="240" w:line="240" w:lineRule="auto"/>
+        <w:rPr>
+          <w:color w:val="000000"/>
+        </w:rPr>
+      </w:pPr>
+      <w:r>
+        <w:rPr>
+          <w:rFonts w:ascii="Arial" w:eastAsia="Arial" w:hAnsi="Arial" w:cs="Arial"/>
+          <w:b/>
+          <w:bCs/>
+          <w:color w:val="000000"/>
+        </w:rPr>
+        <w:t xml:space="preserve">Estadísticas de uso real:</w:t>
+      </w:r>
+      <w:r>
+        <w:rPr>
+          <w:rFonts w:ascii="Arial" w:eastAsia="Arial" w:hAnsi="Arial" w:cs="Arial"/>
+          <w:color w:val="000000"/>
+        </w:rPr>
+        <w:t xml:space="preserve"> la API registra cada ejecución no cacheada de Dijkstra, Held-Karp y el algoritmo genético (módulo solver_metrics.py, últimas 500 ejecuciones en memoria) y las expone en GET /stats/algorithms. La página Laboratorio las muestra en la sección «Estadísticas de uso real», junto a un «Benchmark controlado» que compara Held-Karp y el genético sobre instancias generadas.</w:t>
       </w:r>
     </w:p>
     <w:p>

</xml_diff>

<commit_message>
docs: note benchmark variance
</commit_message>
<xml_diff>
--- a/Informe Final PEF.docx
+++ b/Informe Final PEF.docx
@@ -5683,6 +5683,22 @@
           <w:color w:val="000000"/>
         </w:rPr>
         <w:t xml:space="preserve">La brecha es el exceso del costo del genético sobre el óptimo de Held-Karp en la misma instancia. La proyección usa t = C·n²·2ⁿ, con la constante C calibrada en n = 12 (82 ms). La fórmula predice 0,19 s para 13 ciudades y 0,45 s para 14, cerca de lo medido (0,18 s y 0,43 s), lo que confirma el crecimiento exponencial. El genético, en cambio, tarda entre 2,6 y 4,5 s casi con independencia de n, porque evalúa siempre la misma cantidad de recorridos; en promedio (3,5 s), Held-Karp pasaría a ser más lento a partir de unas 17 ciudades. Los valores absolutos dependen de la carga del equipo: en tres corridas, Held-Karp con 12 ciudades tardó entre 82 y 132 ms. El benchmark del Laboratorio usa una población de 150 y 300 generaciones, por lo que allí el genético resulta algo más rápido.</w:t>
+      </w:r>
+    </w:p>
+    <w:p>
+      <w:pPr>
+        <w:spacing w:before="240" w:after="240" w:line="240" w:lineRule="auto"/>
+        <w:rPr>
+          <w:rFonts w:ascii="Arial" w:eastAsia="Arial" w:hAnsi="Arial" w:cs="Arial"/>
+          <w:color w:val="000000"/>
+        </w:rPr>
+      </w:pPr>
+      <w:r>
+        <w:rPr>
+          <w:rFonts w:ascii="Arial" w:eastAsia="Arial" w:hAnsi="Arial" w:cs="Arial"/>
+          <w:color w:val="000000"/>
+        </w:rPr>
+        <w:t xml:space="preserve">La presentación muestra una corrida de referencia distinta: Held-Karp ≈ 69 ms con 12 ciudades, genético ≈ 2 s, proyección de ≈ 41 min para 25 ciudades y cruce en n ≈ 16. La corrida de este informe dio ≈ 82 ms, ≈ 3,5 s, ≈ 49 min y n ≈ 17. La diferencia se explica por la carga del equipo en cada corrida (las repeticiones difirieron entre un 20 % y un 60 %); el orden de magnitud, el crecimiento exponencial y la decisión del umbral de 12 ciudades son los mismos en ambos casos.</w:t>
       </w:r>
     </w:p>
     <w:p>

</xml_diff>

<commit_message>
docs: update test count
</commit_message>
<xml_diff>
--- a/Informe Final PEF.docx
+++ b/Informe Final PEF.docx
@@ -281,7 +281,7 @@
           <w:rFonts w:ascii="Arial" w:eastAsia="Arial" w:hAnsi="Arial" w:cs="Arial"/>
           <w:color w:val="000000"/>
         </w:rPr>
-        <w:t xml:space="preserve">La API guarda en caché los resultados ya calculados, procesa las reservas en lotes de forma asíncrona y registra métricas reales de cada ejecución de los algoritmos, que la interfaz muestra junto con un benchmark controlado. La interfaz agrega recomendaciones turísticas generadas con Google Gemini según el interés que elige el usuario. El comportamiento se verifica con 178 pruebas automatizadas. El objetivo del trabajo es aplicar los contenidos de la materia (algoritmos de grafos, programación dinámica, concurrencia con asyncio, caché y medición del rendimiento) en un sistema completo y organizado en capas.</w:t>
+        <w:t xml:space="preserve">La API guarda en caché los resultados ya calculados, procesa las reservas en lotes de forma asíncrona y registra métricas reales de cada ejecución de los algoritmos, que la interfaz muestra junto con un benchmark controlado. La interfaz agrega recomendaciones turísticas generadas con Google Gemini según el interés que elige el usuario. El comportamiento se verifica con 214 pruebas automatizadas. El objetivo del trabajo es aplicar los contenidos de la materia (algoritmos de grafos, programación dinámica, concurrencia con asyncio, caché y medición del rendimiento) en un sistema completo y organizado en capas.</w:t>
       </w:r>
     </w:p>
     <w:p>
@@ -5997,7 +5997,7 @@
           <w:rFonts w:ascii="Arial" w:eastAsia="Arial" w:hAnsi="Arial" w:cs="Arial"/>
           <w:color w:val="000000"/>
         </w:rPr>
-        <w:t xml:space="preserve">El proyecto cuenta con 178 pruebas automatizadas con Pytest, que se ejecutan desde la carpeta travel_planner con python </w:t>
+        <w:t xml:space="preserve">El proyecto cuenta con 214 pruebas automatizadas con Pytest, que se ejecutan desde la carpeta travel_planner con python </w:t>
         <w:noBreakHyphen/>
         <w:t xml:space="preserve">m pytest </w:t>
         <w:noBreakHyphen/>
@@ -6750,7 +6750,7 @@
           <w:rFonts w:ascii="Arial" w:eastAsia="Arial" w:hAnsi="Arial" w:cs="Arial"/>
           <w:color w:val="000000"/>
         </w:rPr>
-        <w:t xml:space="preserve">Las mediciones confirmaron el crecimiento exponencial de Held-Karp y justifican el umbral elegido. Las recomendaciones con Gemini complementan el itinerario según el interés del usuario, sin comprometer el resto del sistema cuando el servicio no está disponible. Las 178 pruebas automatizadas y la separación en capas facilitan el mantenimiento, y las limitaciones descritas en la sección 10 señalan las líneas de trabajo futuro.</w:t>
+        <w:t xml:space="preserve">Las mediciones confirmaron el crecimiento exponencial de Held-Karp y justifican el umbral elegido. Las recomendaciones con Gemini complementan el itinerario según el interés del usuario, sin comprometer el resto del sistema cuando el servicio no está disponible. Las 214 pruebas automatizadas y la separación en capas facilitan el mantenimiento, y las limitaciones descritas en la sección 10 señalan las líneas de trabajo futuro.</w:t>
       </w:r>
     </w:p>
     <w:p>

</xml_diff>

<commit_message>
docs: explain held-karp count and metrics
</commit_message>
<xml_diff>
--- a/Informe Final PEF.docx
+++ b/Informe Final PEF.docx
@@ -3051,7 +3051,7 @@
           <w:rFonts w:ascii="Arial" w:eastAsia="Arial" w:hAnsi="Arial" w:cs="Arial"/>
           <w:color w:val="000000"/>
         </w:rPr>
-        <w:t xml:space="preserve"> se reduce la complejidad factorial O(n!) de la fuerza bruta a O(n² · 2ⁿ) en tiempo y O(n · 2ⁿ) en memoria. En la práctica, esto permite resolver de forma exacta y en tiempo interactivo itinerarios de hasta 12 ciudades (aproximadamente 590.000 operaciones elementales, unos 80 ms medidos; sección 9.1). Por encima de ese umbral el sistema recurre al algoritmo genético descrito en la sección 5.4.</w:t>
+        <w:t xml:space="preserve"> se reduce la complejidad factorial O(n!) de la fuerza bruta a O(n² · 2ⁿ) en tiempo y O(n · 2ⁿ) en memoria. La cuenta es directa: hay n · 2ⁿ estados posibles, uno por cada combinación de qué ciudades ya se visitaron y en cuál se está, y en cada estado se prueban hasta n ciudades siguientes; por lo tanto, n · 2ⁿ estados × n pruebas = n² · 2ⁿ operaciones. Como se guarda un resultado por estado, la memoria es n · 2ⁿ. En la práctica, esto permite resolver de forma exacta y en tiempo interactivo itinerarios de hasta 12 ciudades (aproximadamente 590.000 operaciones elementales, unos 80 ms medidos; sección 9.1). Por encima de ese umbral el sistema recurre al algoritmo genético descrito en la sección 5.4.</w:t>
       </w:r>
     </w:p>
     <w:p>
@@ -5682,7 +5682,7 @@
           <w:rFonts w:ascii="Arial" w:eastAsia="Arial" w:hAnsi="Arial" w:cs="Arial"/>
           <w:color w:val="000000"/>
         </w:rPr>
-        <w:t xml:space="preserve">La brecha es el exceso del costo del genético sobre el óptimo de Held-Karp en la misma instancia. La proyección usa t = C·n²·2ⁿ, con la constante C calibrada en n = 12 (82 ms). La fórmula predice 0,19 s para 13 ciudades y 0,45 s para 14, cerca de lo medido (0,18 s y 0,43 s), lo que confirma el crecimiento exponencial. El genético, en cambio, tarda entre 2,6 y 4,5 s casi con independencia de n, porque evalúa siempre la misma cantidad de recorridos; en promedio (3,5 s), Held-Karp pasaría a ser más lento a partir de unas 17 ciudades. Los valores absolutos dependen de la carga del equipo: en tres corridas, Held-Karp con 12 ciudades tardó entre 82 y 132 ms. El benchmark del Laboratorio usa una población de 150 y 300 generaciones, por lo que allí el genético resulta algo más rápido.</w:t>
+        <w:t xml:space="preserve">La brecha es el exceso del costo del genético sobre el óptimo de Held-Karp en la misma instancia. La proyección usa t = C·n²·2ⁿ (t: tiempo; n: cantidad de ciudades), con la constante C calibrada en n = 12 (82 ms). La fórmula predice 0,19 s para 13 ciudades y 0,45 s para 14, cerca de lo medido (0,18 s y 0,43 s), lo que confirma el crecimiento exponencial. El genético, en cambio, tarda entre 2,6 y 4,5 s casi con independencia de n, porque evalúa siempre la misma cantidad de recorridos; en promedio (3,5 s), Held-Karp pasaría a ser más lento a partir de unas 17 ciudades. Los valores absolutos dependen de la carga del equipo: en tres corridas, Held-Karp con 12 ciudades tardó entre 82 y 132 ms. El benchmark del Laboratorio usa una población de 150 y 300 generaciones, por lo que allí el genético resulta algo más rápido.</w:t>
       </w:r>
     </w:p>
     <w:p>
@@ -5789,7 +5789,7 @@
           <w:rFonts w:ascii="Arial" w:eastAsia="Arial" w:hAnsi="Arial" w:cs="Arial"/>
           <w:color w:val="000000"/>
         </w:rPr>
-        <w:t xml:space="preserve"> p50, p95 y máximo por algoritmo, y la media móvil de las últimas 10 ejecuciones, que permite detectar una degradación a lo largo del tiempo.</w:t>
+        <w:t xml:space="preserve"> p50, p95 y máximo por algoritmo, y la media móvil de las últimas 10 ejecuciones. El p50 (mediana) es el tiempo por debajo del cual termina la mitad de las ejecuciones, es decir, el caso típico; el p95 es el tiempo por debajo del cual termina el 95 % y refleja los casos lentos; el máximo es la ejecución más lenta registrada. La media móvil es el promedio de las últimas 10 ejecuciones: si crece con el tiempo, indica una degradación del sistema.</w:t>
       </w:r>
     </w:p>
     <w:p>

</xml_diff>